<commit_message>
Add inline figures in manuscript docx per knowledge rules
Co-Authored-By: Tatsuki Onishi <bougtoir@gmail.com>
</commit_message>
<xml_diff>
--- a/medical_accident_its_analysis/manuscript/jma_manuscript_en.docx
+++ b/medical_accident_its_analysis/manuscript/jma_manuscript_en.docx
@@ -805,6 +805,59 @@
     </w:p>
     <w:p>
       <w:pPr>
+        <w:spacing w:before="240" w:after="120" w:line="480" w:lineRule="auto"/>
+      </w:pPr>
+      <w:r>
+        <w:rPr>
+          <w:rFonts w:ascii="Times New Roman" w:hAnsi="Times New Roman"/>
+          <w:b/>
+          <w:sz w:val="20"/>
+        </w:rPr>
+        <w:t>Figure 1. Trends in medical safety incident counts by specialty.</w:t>
+      </w:r>
+    </w:p>
+    <w:p>
+      <w:pPr>
+        <w:jc w:val="center"/>
+      </w:pPr>
+      <w:r>
+        <w:drawing>
+          <wp:inline xmlns:a="http://schemas.openxmlformats.org/drawingml/2006/main" xmlns:pic="http://schemas.openxmlformats.org/drawingml/2006/picture">
+            <wp:extent cx="5029200" cy="5543311"/>
+            <wp:docPr id="1" name="Picture 1"/>
+            <wp:cNvGraphicFramePr>
+              <a:graphicFrameLocks noChangeAspect="1"/>
+            </wp:cNvGraphicFramePr>
+            <a:graphic>
+              <a:graphicData uri="http://schemas.openxmlformats.org/drawingml/2006/picture">
+                <pic:pic>
+                  <pic:nvPicPr>
+                    <pic:cNvPr id="0" name="fig4_accident_trends.png"/>
+                    <pic:cNvPicPr/>
+                  </pic:nvPicPr>
+                  <pic:blipFill>
+                    <a:blip r:embed="rId9"/>
+                    <a:stretch>
+                      <a:fillRect/>
+                    </a:stretch>
+                  </pic:blipFill>
+                  <pic:spPr>
+                    <a:xfrm>
+                      <a:off x="0" y="0"/>
+                      <a:ext cx="5029200" cy="5543311"/>
+                    </a:xfrm>
+                    <a:prstGeom prst="rect"/>
+                  </pic:spPr>
+                </pic:pic>
+              </a:graphicData>
+            </a:graphic>
+          </wp:inline>
+        </w:drawing>
+      </w:r>
+    </w:p>
+    <w:p/>
+    <w:p>
+      <w:pPr>
         <w:pStyle w:val="Heading2"/>
       </w:pPr>
       <w:r>
@@ -7978,6 +8031,117 @@
     </w:p>
     <w:p>
       <w:pPr>
+        <w:spacing w:before="240" w:after="120" w:line="480" w:lineRule="auto"/>
+      </w:pPr>
+      <w:r>
+        <w:rPr>
+          <w:rFonts w:ascii="Times New Roman" w:hAnsi="Times New Roman"/>
+          <w:b/>
+          <w:sz w:val="20"/>
+        </w:rPr>
+        <w:t>Figure 2. IRF: physician count response to a one-unit litigation shock.</w:t>
+      </w:r>
+    </w:p>
+    <w:p>
+      <w:pPr>
+        <w:jc w:val="center"/>
+      </w:pPr>
+      <w:r>
+        <w:drawing>
+          <wp:inline xmlns:a="http://schemas.openxmlformats.org/drawingml/2006/main" xmlns:pic="http://schemas.openxmlformats.org/drawingml/2006/picture">
+            <wp:extent cx="5029200" cy="5927271"/>
+            <wp:docPr id="2" name="Picture 2"/>
+            <wp:cNvGraphicFramePr>
+              <a:graphicFrameLocks noChangeAspect="1"/>
+            </wp:cNvGraphicFramePr>
+            <a:graphic>
+              <a:graphicData uri="http://schemas.openxmlformats.org/drawingml/2006/picture">
+                <pic:pic>
+                  <pic:nvPicPr>
+                    <pic:cNvPr id="0" name="fig2_irf_physicians.png"/>
+                    <pic:cNvPicPr/>
+                  </pic:nvPicPr>
+                  <pic:blipFill>
+                    <a:blip r:embed="rId10"/>
+                    <a:stretch>
+                      <a:fillRect/>
+                    </a:stretch>
+                  </pic:blipFill>
+                  <pic:spPr>
+                    <a:xfrm>
+                      <a:off x="0" y="0"/>
+                      <a:ext cx="5029200" cy="5927271"/>
+                    </a:xfrm>
+                    <a:prstGeom prst="rect"/>
+                  </pic:spPr>
+                </pic:pic>
+              </a:graphicData>
+            </a:graphic>
+          </wp:inline>
+        </w:drawing>
+      </w:r>
+    </w:p>
+    <w:p/>
+    <w:p>
+      <w:pPr>
+        <w:spacing w:before="240" w:after="120" w:line="480" w:lineRule="auto"/>
+      </w:pPr>
+      <w:r>
+        <w:rPr>
+          <w:rFonts w:ascii="Times New Roman" w:hAnsi="Times New Roman"/>
+          <w:b/>
+          <w:sz w:val="20"/>
+        </w:rPr>
+        <w:t>Figure 3. IRF: facility count response to a one-unit litigation shock.</w:t>
+      </w:r>
+    </w:p>
+    <w:p>
+      <w:pPr>
+        <w:jc w:val="center"/>
+      </w:pPr>
+      <w:r>
+        <w:drawing>
+          <wp:inline xmlns:a="http://schemas.openxmlformats.org/drawingml/2006/main" xmlns:pic="http://schemas.openxmlformats.org/drawingml/2006/picture">
+            <wp:extent cx="5029200" cy="5927271"/>
+            <wp:docPr id="3" name="Picture 3"/>
+            <wp:cNvGraphicFramePr>
+              <a:graphicFrameLocks noChangeAspect="1"/>
+            </wp:cNvGraphicFramePr>
+            <a:graphic>
+              <a:graphicData uri="http://schemas.openxmlformats.org/drawingml/2006/picture">
+                <pic:pic>
+                  <pic:nvPicPr>
+                    <pic:cNvPr id="0" name="sfig1_irf_facilities.png"/>
+                    <pic:cNvPicPr/>
+                  </pic:nvPicPr>
+                  <pic:blipFill>
+                    <a:blip r:embed="rId11"/>
+                    <a:stretch>
+                      <a:fillRect/>
+                    </a:stretch>
+                  </pic:blipFill>
+                  <pic:spPr>
+                    <a:xfrm>
+                      <a:off x="0" y="0"/>
+                      <a:ext cx="5029200" cy="5927271"/>
+                    </a:xfrm>
+                    <a:prstGeom prst="rect"/>
+                  </pic:spPr>
+                </pic:pic>
+              </a:graphicData>
+            </a:graphic>
+          </wp:inline>
+        </w:drawing>
+      </w:r>
+    </w:p>
+    <w:p/>
+    <w:p>
+      <w:r>
+        <w:br w:type="page"/>
+      </w:r>
+    </w:p>
+    <w:p>
+      <w:pPr>
         <w:pStyle w:val="Heading2"/>
       </w:pPr>
       <w:r>
@@ -8002,6 +8166,59 @@
         <w:t>Figure 4 presents VAR-based forecasts for physician and facility counts. General surgery is projected to continue declining (physicians: −230/year; facilities: −310/year through 2033). Obstetrics and gynaecology physician counts show modest growth while facilities decline. Table 3 summarises forecast values.</w:t>
       </w:r>
     </w:p>
+    <w:p>
+      <w:pPr>
+        <w:spacing w:before="240" w:after="120" w:line="480" w:lineRule="auto"/>
+      </w:pPr>
+      <w:r>
+        <w:rPr>
+          <w:rFonts w:ascii="Times New Roman" w:hAnsi="Times New Roman"/>
+          <w:b/>
+          <w:sz w:val="20"/>
+        </w:rPr>
+        <w:t>Figure 4. VAR-based forecasts of physician and facility counts (2024–2033).</w:t>
+      </w:r>
+    </w:p>
+    <w:p>
+      <w:pPr>
+        <w:jc w:val="center"/>
+      </w:pPr>
+      <w:r>
+        <w:drawing>
+          <wp:inline xmlns:a="http://schemas.openxmlformats.org/drawingml/2006/main" xmlns:pic="http://schemas.openxmlformats.org/drawingml/2006/picture">
+            <wp:extent cx="5029200" cy="5925851"/>
+            <wp:docPr id="4" name="Picture 4"/>
+            <wp:cNvGraphicFramePr>
+              <a:graphicFrameLocks noChangeAspect="1"/>
+            </wp:cNvGraphicFramePr>
+            <a:graphic>
+              <a:graphicData uri="http://schemas.openxmlformats.org/drawingml/2006/picture">
+                <pic:pic>
+                  <pic:nvPicPr>
+                    <pic:cNvPr id="0" name="fig3_var_forecasts.png"/>
+                    <pic:cNvPicPr/>
+                  </pic:nvPicPr>
+                  <pic:blipFill>
+                    <a:blip r:embed="rId12"/>
+                    <a:stretch>
+                      <a:fillRect/>
+                    </a:stretch>
+                  </pic:blipFill>
+                  <pic:spPr>
+                    <a:xfrm>
+                      <a:off x="0" y="0"/>
+                      <a:ext cx="5029200" cy="5925851"/>
+                    </a:xfrm>
+                    <a:prstGeom prst="rect"/>
+                  </pic:spPr>
+                </pic:pic>
+              </a:graphicData>
+            </a:graphic>
+          </wp:inline>
+        </w:drawing>
+      </w:r>
+    </w:p>
+    <w:p/>
     <w:p>
       <w:pPr>
         <w:spacing w:after="120" w:before="240" w:line="480" w:lineRule="auto"/>

</xml_diff>

<commit_message>
Revise tone: move aesthetic/occupational medicine to limitations, fix overestimate direction, remove Japanese text, fix citation order
Co-Authored-By: Tatsuki Onishi <bougtoir@gmail.com>
</commit_message>
<xml_diff>
--- a/medical_accident_its_analysis/manuscript/jma_manuscript_en.docx
+++ b/medical_accident_its_analysis/manuscript/jma_manuscript_en.docx
@@ -33,7 +33,7 @@
           <w:i w:val="0"/>
           <w:sz w:val="24"/>
         </w:rPr>
-        <w:t>Medical safety incidents may deter physicians from high-risk specialties, yet the temporal dynamics of this relationship remain poorly quantified. In Japan, physician workforce maldistribution has intensified amid the 2024 work-style reform and the growing "chokubi" phenomenon—young physicians bypassing specialist training to enter non-insured aesthetic medicine.</w:t>
+        <w:t>Medical safety incidents may deter physicians from high-risk specialties, yet the temporal dynamics of this relationship remain poorly quantified. In Japan, physician workforce maldistribution has intensified amid the 2024 work-style reform, yet the temporal relationship between safety incidents and specialty-specific workforce supply has not been formally tested.</w:t>
       </w:r>
     </w:p>
     <w:p>
@@ -99,7 +99,7 @@
           <w:i w:val="0"/>
           <w:sz w:val="24"/>
         </w:rPr>
-        <w:t>Medical safety incidents Granger-cause reductions in physician supply across most specialties, with effects lasting 3–5 years. Combined with work-style reform constraints and the pull of non-insured sectors, these findings highlight an accelerating workforce crisis requiring integrated policy responses.</w:t>
+        <w:t>Medical safety incidents Granger-cause reductions in physician supply across most specialties, with effects lasting 3–5 years. Combined with work-style reform constraints, these findings highlight an accelerating workforce crisis requiring integrated policy responses.</w:t>
       </w:r>
     </w:p>
     <w:p>
@@ -113,7 +113,7 @@
           <w:i/>
           <w:sz w:val="24"/>
         </w:rPr>
-        <w:t>Key words: physician workforce, Granger causality, medical safety incidents, specialty maldistribution, work-style reform, aesthetic medicine, Japan</w:t>
+        <w:t>Key words: physician workforce, Granger causality, medical safety incidents, specialty maldistribution, work-style reform, Japan</w:t>
       </w:r>
     </w:p>
     <w:p>
@@ -187,7 +187,7 @@
           <w:i w:val="0"/>
           <w:sz w:val="24"/>
         </w:rPr>
-        <w:t>Two recent developments have amplified public concern over specialty maldistribution. First, the "chokubi" (直美) phenomenon—in which newly licensed physicians bypass specialist training to enter non-insured aesthetic medicine immediately after their mandatory 2-year residency—has drawn considerable media and policy attention.</w:t>
+        <w:t>In parallel, the April 2024 implementation of physician work-style reform (time-based overtime caps of 960 hours annually) has restricted "gaikin" (moonlighting opportunities) that previously supplemented income in lower-paying hospital posts.</w:t>
       </w:r>
       <w:r>
         <w:rPr>
@@ -206,55 +206,7 @@
           <w:i w:val="0"/>
           <w:sz w:val="24"/>
         </w:rPr>
-        <w:t xml:space="preserve"> An estimated 200–300 physicians (2–3% of annual new registrants) now take this path, attracted by salaries exceeding 20 million JPY and regular working hours without night shifts.</w:t>
-      </w:r>
-      <w:r>
-        <w:rPr>
-          <w:rFonts w:ascii="Times New Roman" w:hAnsi="Times New Roman"/>
-          <w:b w:val="0"/>
-          <w:i w:val="0"/>
-          <w:sz w:val="20"/>
-          <w:vertAlign w:val="superscript"/>
-        </w:rPr>
-        <w:t>5</w:t>
-      </w:r>
-      <w:r>
-        <w:rPr>
-          <w:rFonts w:ascii="Times New Roman" w:hAnsi="Times New Roman"/>
-          <w:b w:val="0"/>
-          <w:i w:val="0"/>
-          <w:sz w:val="24"/>
-        </w:rPr>
-        <w:t xml:space="preserve"> Second, the April 2024 implementation of physician work-style reform (time-based overtime caps of 960 hours annually) has restricted moonlighting opportunities ("gaikin") that previously supplemented income in lower-paying hospital posts, paradoxically increasing workload for mid-career physicians through uncompensated labour classified as "deemed self-study" (minashi jiko-kenshu).</w:t>
-      </w:r>
-      <w:r>
-        <w:rPr>
-          <w:rFonts w:ascii="Times New Roman" w:hAnsi="Times New Roman"/>
-          <w:b w:val="0"/>
-          <w:i w:val="0"/>
-          <w:sz w:val="20"/>
-          <w:vertAlign w:val="superscript"/>
-        </w:rPr>
-        <w:t>7,8</w:t>
-      </w:r>
-      <w:r>
-        <w:rPr>
-          <w:rFonts w:ascii="Times New Roman" w:hAnsi="Times New Roman"/>
-          <w:b w:val="0"/>
-          <w:i w:val="0"/>
-          <w:sz w:val="24"/>
-        </w:rPr>
-        <w:t xml:space="preserve"> These structural incentives, combined with occupational medicine (sangyoui) offering stable corporate employment without clinical risk, create powerful pull factors away from high-acuity hospital-based specialties.</w:t>
-      </w:r>
-      <w:r>
-        <w:rPr>
-          <w:rFonts w:ascii="Times New Roman" w:hAnsi="Times New Roman"/>
-          <w:b w:val="0"/>
-          <w:i w:val="0"/>
-          <w:sz w:val="20"/>
-          <w:vertAlign w:val="superscript"/>
-        </w:rPr>
-        <w:t>9</w:t>
+        <w:t xml:space="preserve"> These regulatory changes may interact with safety-incident-driven workforce dynamics, yet existing evidence is limited to single-event, single-specialty case studies.</w:t>
       </w:r>
     </w:p>
     <w:p>
@@ -278,7 +230,7 @@
           <w:sz w:val="20"/>
           <w:vertAlign w:val="superscript"/>
         </w:rPr>
-        <w:t>10,11</w:t>
+        <w:t>7,8</w:t>
       </w:r>
       <w:r>
         <w:rPr>
@@ -297,7 +249,7 @@
           <w:sz w:val="20"/>
           <w:vertAlign w:val="superscript"/>
         </w:rPr>
-        <w:t>12</w:t>
+        <w:t>9</w:t>
       </w:r>
       <w:r>
         <w:rPr>
@@ -330,7 +282,7 @@
           <w:sz w:val="20"/>
           <w:vertAlign w:val="superscript"/>
         </w:rPr>
-        <w:t>13</w:t>
+        <w:t>10</w:t>
       </w:r>
       <w:r>
         <w:rPr>
@@ -349,7 +301,7 @@
           <w:sz w:val="20"/>
           <w:vertAlign w:val="superscript"/>
         </w:rPr>
-        <w:t>14,15</w:t>
+        <w:t>11,12</w:t>
       </w:r>
       <w:r>
         <w:rPr>
@@ -382,7 +334,7 @@
           <w:sz w:val="20"/>
           <w:vertAlign w:val="superscript"/>
         </w:rPr>
-        <w:t>16</w:t>
+        <w:t>13</w:t>
       </w:r>
       <w:r>
         <w:rPr>
@@ -401,7 +353,7 @@
           <w:sz w:val="20"/>
           <w:vertAlign w:val="superscript"/>
         </w:rPr>
-        <w:t>17–19</w:t>
+        <w:t>14–16</w:t>
       </w:r>
       <w:r>
         <w:rPr>
@@ -463,7 +415,7 @@
           <w:sz w:val="20"/>
           <w:vertAlign w:val="superscript"/>
         </w:rPr>
-        <w:t>20</w:t>
+        <w:t>17</w:t>
       </w:r>
     </w:p>
     <w:p>
@@ -499,7 +451,7 @@
           <w:sz w:val="20"/>
           <w:vertAlign w:val="superscript"/>
         </w:rPr>
-        <w:t>13</w:t>
+        <w:t>10</w:t>
       </w:r>
       <w:r>
         <w:rPr>
@@ -518,7 +470,7 @@
           <w:sz w:val="20"/>
           <w:vertAlign w:val="superscript"/>
         </w:rPr>
-        <w:t>14</w:t>
+        <w:t>11</w:t>
       </w:r>
     </w:p>
     <w:p>
@@ -542,7 +494,7 @@
           <w:sz w:val="20"/>
           <w:vertAlign w:val="superscript"/>
         </w:rPr>
-        <w:t>21</w:t>
+        <w:t>18</w:t>
       </w:r>
       <w:r>
         <w:rPr>
@@ -561,7 +513,7 @@
           <w:sz w:val="20"/>
           <w:vertAlign w:val="superscript"/>
         </w:rPr>
-        <w:t>22</w:t>
+        <w:t>19</w:t>
       </w:r>
       <w:r>
         <w:rPr>
@@ -580,7 +532,7 @@
           <w:sz w:val="20"/>
           <w:vertAlign w:val="superscript"/>
         </w:rPr>
-        <w:t>23</w:t>
+        <w:t>20</w:t>
       </w:r>
     </w:p>
     <w:p>
@@ -656,7 +608,7 @@
           <w:sz w:val="20"/>
           <w:vertAlign w:val="superscript"/>
         </w:rPr>
-        <w:t>24</w:t>
+        <w:t>21</w:t>
       </w:r>
       <w:r>
         <w:rPr>
@@ -689,7 +641,7 @@
           <w:sz w:val="20"/>
           <w:vertAlign w:val="superscript"/>
         </w:rPr>
-        <w:t>25</w:t>
+        <w:t>22</w:t>
       </w:r>
       <w:r>
         <w:rPr>
@@ -722,7 +674,7 @@
           <w:sz w:val="20"/>
           <w:vertAlign w:val="superscript"/>
         </w:rPr>
-        <w:t>26</w:t>
+        <w:t>23</w:t>
       </w:r>
       <w:r>
         <w:rPr>
@@ -9255,7 +9207,7 @@
           <w:sz w:val="20"/>
           <w:vertAlign w:val="superscript"/>
         </w:rPr>
-        <w:t>16</w:t>
+        <w:t>13</w:t>
       </w:r>
       <w:r>
         <w:rPr>
@@ -9300,7 +9252,7 @@
           <w:sz w:val="20"/>
           <w:vertAlign w:val="superscript"/>
         </w:rPr>
-        <w:t>1,12</w:t>
+        <w:t>1,9</w:t>
       </w:r>
       <w:r>
         <w:rPr>
@@ -9319,7 +9271,7 @@
           <w:sz w:val="20"/>
           <w:vertAlign w:val="superscript"/>
         </w:rPr>
-        <w:t>27</w:t>
+        <w:t>24</w:t>
       </w:r>
       <w:r>
         <w:rPr>
@@ -9340,7 +9292,7 @@
           <w:rFonts w:ascii="Times New Roman" w:hAnsi="Times New Roman"/>
           <w:color w:val="000000"/>
         </w:rPr>
-        <w:t>Context: work-style reform and the "chokubi" phenomenon</w:t>
+        <w:t>Context: work-style reform</w:t>
       </w:r>
     </w:p>
     <w:p>
@@ -9364,7 +9316,7 @@
           <w:sz w:val="20"/>
           <w:vertAlign w:val="superscript"/>
         </w:rPr>
-        <w:t>7</w:t>
+        <w:t>5</w:t>
       </w:r>
       <w:r>
         <w:rPr>
@@ -9373,7 +9325,7 @@
           <w:i w:val="0"/>
           <w:sz w:val="24"/>
         </w:rPr>
-        <w:t xml:space="preserve"> While intended to improve physician well-being, the reform has produced several unintended consequences. Restrictions on moonlighting ("gaikin")—historically an important income supplement for hospital-based physicians—have reduced the financial attractiveness of demanding specialties. Moreover, the phenomenon of "deemed self-study" (minashi jiko-kenshu), whereby hours exceeding the cap are reclassified as voluntary training rather than labour, has paradoxically increased uncompensated workload for mid-career physicians while failing to improve working conditions for trainees.</w:t>
+        <w:t xml:space="preserve"> While intended to improve physician well-being, the reform has produced several unintended consequences. Restrictions on "gaikin" (moonlighting opportunities)—historically an important income supplement for hospital-based physicians—have reduced the financial attractiveness of demanding specialties. Moreover, deemed self-study, whereby hours exceeding the cap are reclassified as voluntary training rather than labour, has paradoxically increased uncompensated workload for mid-career physicians while failing to improve working conditions for trainees.</w:t>
       </w:r>
       <w:r>
         <w:rPr>
@@ -9383,7 +9335,7 @@
           <w:sz w:val="20"/>
           <w:vertAlign w:val="superscript"/>
         </w:rPr>
-        <w:t>8</w:t>
+        <w:t>6</w:t>
       </w:r>
     </w:p>
     <w:p>
@@ -9397,111 +9349,7 @@
           <w:i w:val="0"/>
           <w:sz w:val="24"/>
         </w:rPr>
-        <w:t>Simultaneously, the "chokubi" phenomenon represents a growing pull factor. Approximately 200–300 newly registered physicians annually now enter non-insured aesthetic medicine directly after residency, bypassing specialist certification entirely.</w:t>
-      </w:r>
-      <w:r>
-        <w:rPr>
-          <w:rFonts w:ascii="Times New Roman" w:hAnsi="Times New Roman"/>
-          <w:b w:val="0"/>
-          <w:i w:val="0"/>
-          <w:sz w:val="20"/>
-          <w:vertAlign w:val="superscript"/>
-        </w:rPr>
-        <w:t>5,6</w:t>
-      </w:r>
-      <w:r>
-        <w:rPr>
-          <w:rFonts w:ascii="Times New Roman" w:hAnsi="Times New Roman"/>
-          <w:b w:val="0"/>
-          <w:i w:val="0"/>
-          <w:sz w:val="24"/>
-        </w:rPr>
-        <w:t xml:space="preserve"> The number of physicians primarily employed in aesthetic surgery clinics tripled between 2008 and 2022, with half aged under 40.</w:t>
-      </w:r>
-      <w:r>
-        <w:rPr>
-          <w:rFonts w:ascii="Times New Roman" w:hAnsi="Times New Roman"/>
-          <w:b w:val="0"/>
-          <w:i w:val="0"/>
-          <w:sz w:val="20"/>
-          <w:vertAlign w:val="superscript"/>
-        </w:rPr>
-        <w:t>5</w:t>
-      </w:r>
-      <w:r>
-        <w:rPr>
-          <w:rFonts w:ascii="Times New Roman" w:hAnsi="Times New Roman"/>
-          <w:b w:val="0"/>
-          <w:i w:val="0"/>
-          <w:sz w:val="24"/>
-        </w:rPr>
-        <w:t xml:space="preserve"> Entry-level salaries in aesthetic clinics (&gt;20 million JPY) far exceed those in hospital training posts (4.35 million JPY for residents), and these positions offer predictable hours without night calls or emergency duties.</w:t>
-      </w:r>
-    </w:p>
-    <w:p>
-      <w:pPr>
-        <w:spacing w:after="120" w:line="480" w:lineRule="auto"/>
-      </w:pPr>
-      <w:r>
-        <w:rPr>
-          <w:rFonts w:ascii="Times New Roman" w:hAnsi="Times New Roman"/>
-          <w:b w:val="0"/>
-          <w:i w:val="0"/>
-          <w:sz w:val="24"/>
-        </w:rPr>
-        <w:t>A parallel trend is the early career shift to occupational medicine (sangyoui), where corporate employment offers stable income, minimal litigation risk, and regular hours.</w:t>
-      </w:r>
-      <w:r>
-        <w:rPr>
-          <w:rFonts w:ascii="Times New Roman" w:hAnsi="Times New Roman"/>
-          <w:b w:val="0"/>
-          <w:i w:val="0"/>
-          <w:sz w:val="20"/>
-          <w:vertAlign w:val="superscript"/>
-        </w:rPr>
-        <w:t>9,28</w:t>
-      </w:r>
-      <w:r>
-        <w:rPr>
-          <w:rFonts w:ascii="Times New Roman" w:hAnsi="Times New Roman"/>
-          <w:b w:val="0"/>
-          <w:i w:val="0"/>
-          <w:sz w:val="24"/>
-        </w:rPr>
-        <w:t xml:space="preserve"> Although occupational physicians serve an essential public health function, the low retention rate (55–65% turnover within 2 years)</w:t>
-      </w:r>
-      <w:r>
-        <w:rPr>
-          <w:rFonts w:ascii="Times New Roman" w:hAnsi="Times New Roman"/>
-          <w:b w:val="0"/>
-          <w:i w:val="0"/>
-          <w:sz w:val="20"/>
-          <w:vertAlign w:val="superscript"/>
-        </w:rPr>
-        <w:t>28</w:t>
-      </w:r>
-      <w:r>
-        <w:rPr>
-          <w:rFonts w:ascii="Times New Roman" w:hAnsi="Times New Roman"/>
-          <w:b w:val="0"/>
-          <w:i w:val="0"/>
-          <w:sz w:val="24"/>
-        </w:rPr>
-        <w:t xml:space="preserve"> suggests that for many, it functions as a temporary refuge from clinical demands rather than a committed career path.</w:t>
-      </w:r>
-    </w:p>
-    <w:p>
-      <w:pPr>
-        <w:spacing w:after="120" w:line="480" w:lineRule="auto"/>
-      </w:pPr>
-      <w:r>
-        <w:rPr>
-          <w:rFonts w:ascii="Times New Roman" w:hAnsi="Times New Roman"/>
-          <w:b w:val="0"/>
-          <w:i w:val="0"/>
-          <w:sz w:val="24"/>
-        </w:rPr>
-        <w:t>Our Granger causality results illuminate the push side of this equation: safety incidents actively drive physicians away from high-risk specialties over a 3–5 year horizon. When combined with the structural pull of non-insured sectors and the reduced financial incentives imposed by work-style reform, the result is an accelerating workforce crisis in precisely those specialties that society most needs—surgery, obstetrics, emergency medicine, and paediatrics.</w:t>
+        <w:t>Our Granger causality results illuminate the push side of this equation: safety incidents actively drive physicians away from high-risk specialties over a 3–5 year horizon. When combined with the reduced financial incentives imposed by work-style reform, the result is an accelerating workforce crisis in precisely those specialties that society most needs—surgery, obstetrics, emergency medicine, and paediatrics.</w:t>
       </w:r>
     </w:p>
     <w:p>
@@ -9537,7 +9385,7 @@
           <w:sz w:val="20"/>
           <w:vertAlign w:val="superscript"/>
         </w:rPr>
-        <w:t>10,29</w:t>
+        <w:t>7,25</w:t>
       </w:r>
       <w:r>
         <w:rPr>
@@ -9546,26 +9394,7 @@
           <w:i w:val="0"/>
           <w:sz w:val="24"/>
         </w:rPr>
-        <w:t xml:space="preserve"> On the pull side, the Ministry of Health, Labour and Welfare’s 2024 draft measures to restrict new clinic openings in physician-surplus areas may function to attenuate the outflow from essential specialties into non-insured practice. However, such regulatory approaches face constitutional challenges regarding freedom of practice and may prove insufficient without simultaneously addressing the structural remuneration gap between insured and non-insured medicine—entry-level aesthetic clinic salaries exceed hospital trainee salaries by nearly five-fold.</w:t>
-      </w:r>
-      <w:r>
-        <w:rPr>
-          <w:rFonts w:ascii="Times New Roman" w:hAnsi="Times New Roman"/>
-          <w:b w:val="0"/>
-          <w:i w:val="0"/>
-          <w:sz w:val="20"/>
-          <w:vertAlign w:val="superscript"/>
-        </w:rPr>
-        <w:t>5</w:t>
-      </w:r>
-      <w:r>
-        <w:rPr>
-          <w:rFonts w:ascii="Times New Roman" w:hAnsi="Times New Roman"/>
-          <w:b w:val="0"/>
-          <w:i w:val="0"/>
-          <w:sz w:val="24"/>
-        </w:rPr>
-        <w:t xml:space="preserve"> The IRF results, showing 3–5 year effect duration, define a critical intervention window during which combined regulatory and incentive-based policies could be most effective.</w:t>
+        <w:t xml:space="preserve"> On the pull side, the Ministry of Health, Labour and Welfare’s 2024 draft measures to restrict new clinic openings in physician-surplus areas may function to attenuate the outflow from essential specialties. The IRF results, showing 3–5 year effect duration, define a critical intervention window during which combined regulatory and incentive-based policies could be most effective.</w:t>
       </w:r>
     </w:p>
     <w:p>
@@ -9605,7 +9434,78 @@
           <w:i w:val="0"/>
           <w:sz w:val="24"/>
         </w:rPr>
-        <w:t>Strengths include population-level data from mandatory national registries across 12 specialties over up to 20 years, and the application of VAR/Granger methodology suited to continuously varying exposures. Limitations include the ecological study design precluding individual-level causal inference; biennial physician data requiring interpolation; limited power in the JMSR series (11 years); and unmeasured confounders including demographic shifts, the 2004 postgraduate training reform, and the direct effects of work-style reform itself (which overlaps temporally with the most recent data points).</w:t>
+        <w:t>Strengths include population-level data from mandatory national registries across 12 specialties over up to 20 years, and the application of VAR/Granger methodology suited to continuously varying exposures.</w:t>
+      </w:r>
+    </w:p>
+    <w:p>
+      <w:pPr>
+        <w:spacing w:after="120" w:line="480" w:lineRule="auto"/>
+      </w:pPr>
+      <w:r>
+        <w:rPr>
+          <w:rFonts w:ascii="Times New Roman" w:hAnsi="Times New Roman"/>
+          <w:b w:val="0"/>
+          <w:i w:val="0"/>
+          <w:sz w:val="24"/>
+        </w:rPr>
+        <w:t>Limitations include the ecological study design precluding individual-level causal inference; biennial physician data requiring interpolation; limited power in the JMSR series (11 years); and unmeasured confounders including demographic shifts, the 2004 postgraduate training reform, and the direct effects of work-style reform itself (which overlaps temporally with the most recent data points). Importantly, our 12-specialty framework does not capture career paths that fall outside conventional specialty registration, notably aesthetic medicine</w:t>
+      </w:r>
+      <w:r>
+        <w:rPr>
+          <w:rFonts w:ascii="Times New Roman" w:hAnsi="Times New Roman"/>
+          <w:b w:val="0"/>
+          <w:i w:val="0"/>
+          <w:sz w:val="20"/>
+          <w:vertAlign w:val="superscript"/>
+        </w:rPr>
+        <w:t>26,27</w:t>
+      </w:r>
+      <w:r>
+        <w:rPr>
+          <w:rFonts w:ascii="Times New Roman" w:hAnsi="Times New Roman"/>
+          <w:b w:val="0"/>
+          <w:i w:val="0"/>
+          <w:sz w:val="24"/>
+        </w:rPr>
+        <w:t xml:space="preserve"> and occupational medicine.</w:t>
+      </w:r>
+      <w:r>
+        <w:rPr>
+          <w:rFonts w:ascii="Times New Roman" w:hAnsi="Times New Roman"/>
+          <w:b w:val="0"/>
+          <w:i w:val="0"/>
+          <w:sz w:val="20"/>
+          <w:vertAlign w:val="superscript"/>
+        </w:rPr>
+        <w:t>28,29</w:t>
+      </w:r>
+      <w:r>
+        <w:rPr>
+          <w:rFonts w:ascii="Times New Roman" w:hAnsi="Times New Roman"/>
+          <w:b w:val="0"/>
+          <w:i w:val="0"/>
+          <w:sz w:val="24"/>
+        </w:rPr>
+        <w:t xml:space="preserve"> The growing migration of early-career physicians into these non-traditionally-classified sectors may confound our estimates; to the extent that pull-driven exits correlate temporally with incident trends, our models may overestimate the incident-attributable component of workforce decline. Low retention among occupational physicians (55–65% turnover within 2 years)</w:t>
+      </w:r>
+      <w:r>
+        <w:rPr>
+          <w:rFonts w:ascii="Times New Roman" w:hAnsi="Times New Roman"/>
+          <w:b w:val="0"/>
+          <w:i w:val="0"/>
+          <w:sz w:val="20"/>
+          <w:vertAlign w:val="superscript"/>
+        </w:rPr>
+        <w:t>29</w:t>
+      </w:r>
+      <w:r>
+        <w:rPr>
+          <w:rFonts w:ascii="Times New Roman" w:hAnsi="Times New Roman"/>
+          <w:b w:val="0"/>
+          <w:i w:val="0"/>
+          <w:sz w:val="24"/>
+        </w:rPr>
+        <w:t xml:space="preserve"> further complicates workforce planning assumptions.</w:t>
       </w:r>
     </w:p>
     <w:p>
@@ -9631,7 +9531,7 @@
           <w:i w:val="0"/>
           <w:sz w:val="24"/>
         </w:rPr>
-        <w:t>Medical safety incidents in Japan Granger-cause reductions in specialty-specific physician supply in 9 of 12 specialties, with effects persisting for 3–5 years. Bidirectional causality in obstetrics, paediatrics, and general surgery suggests a self-reinforcing shortage–incident cycle. In the context of work-style reform and the growing migration of young physicians to non-insured sectors, these temporal dynamics pose an urgent threat to essential medical services. Integrated policy responses addressing both the push of safety incidents and the pull of alternative career paths are needed.</w:t>
+        <w:t>Medical safety incidents in Japan Granger-cause reductions in specialty-specific physician supply in 9 of 12 specialties, with effects persisting for 3–5 years. Bidirectional causality in obstetrics, paediatrics, and general surgery suggests a self-reinforcing shortage–incident cycle. In the context of work-style reform and career paths outside conventional specialty frameworks, these temporal dynamics pose an urgent threat to essential medical services. Integrated policy responses addressing both the push of safety incidents and the pull of alternative career paths are needed.</w:t>
       </w:r>
     </w:p>
     <w:p>
@@ -9843,7 +9743,7 @@
           <w:rFonts w:ascii="Times New Roman" w:hAnsi="Times New Roman"/>
           <w:sz w:val="20"/>
         </w:rPr>
-        <w:t>5. Takei T. The ‘Chokubi’ phenomenon: young physicians’ exodus from state service to private medicine in Japan. QJM. 2024;117(12):843-5.</w:t>
+        <w:t>5. Ishikawa T, Ohba H, Yokooka Y, et al. Labor shortage of physicians in rural areas and surgical specialties caused by Work Style Reform Policies of the Japanese government: a quantitative simulation analysis. J Rural Med. 2024;19(3):198-207.</w:t>
       </w:r>
     </w:p>
     <w:p>
@@ -9855,7 +9755,7 @@
           <w:rFonts w:ascii="Times New Roman" w:hAnsi="Times New Roman"/>
           <w:sz w:val="20"/>
         </w:rPr>
-        <w:t>6. Ministry of Health, Labour and Welfare. Survey of medical institutions 2023: aesthetic surgery clinics. Tokyo: MHLW; 2024. Japanese.</w:t>
+        <w:t>6. Japan Medical Association. Survey on physician work-style reform implementation status. Tokyo: JMA; 2024. Japanese.</w:t>
       </w:r>
     </w:p>
     <w:p>
@@ -9867,7 +9767,7 @@
           <w:rFonts w:ascii="Times New Roman" w:hAnsi="Times New Roman"/>
           <w:sz w:val="20"/>
         </w:rPr>
-        <w:t>7. Ishikawa T, Ohba H, Yokooka Y, et al. Labor shortage of physicians in rural areas and surgical specialties caused by Work Style Reform Policies of the Japanese government: a quantitative simulation analysis. J Rural Med. 2024;19(3):198-207.</w:t>
+        <w:t>7. Nagamatsu S, Kami M, Nakata Y. Healthcare safety committee in Japan: mandatory accountability reporting system and punishment. Curr Opin Anaesthesiol. 2009;22(2):199-206.</w:t>
       </w:r>
     </w:p>
     <w:p>
@@ -9879,7 +9779,7 @@
           <w:rFonts w:ascii="Times New Roman" w:hAnsi="Times New Roman"/>
           <w:sz w:val="20"/>
         </w:rPr>
-        <w:t>8. Japan Medical Association. Survey on physician work-style reform implementation status. Tokyo: JMA; 2024. Japanese.</w:t>
+        <w:t>8. Hiyama T, Yoshihara M, Tanaka S, et al. Defensive medicine practices among gastroenterologists in Japan. World J Gastroenterol. 2006;12(47):7671-5.</w:t>
       </w:r>
     </w:p>
     <w:p>
@@ -9891,7 +9791,7 @@
           <w:rFonts w:ascii="Times New Roman" w:hAnsi="Times New Roman"/>
           <w:sz w:val="20"/>
         </w:rPr>
-        <w:t>9. Koike S, Isse T, Kawaguchi H, et al. Retention among full-time occupational physicians in Japan. Occup Med (Lond). 2019;69(2):139-42.</w:t>
+        <w:t>9. Morita H. Criminal prosecution and physician supply. Int Rev Law Econ. 2018;55:1-11.</w:t>
       </w:r>
     </w:p>
     <w:p>
@@ -9903,7 +9803,7 @@
           <w:rFonts w:ascii="Times New Roman" w:hAnsi="Times New Roman"/>
           <w:sz w:val="20"/>
         </w:rPr>
-        <w:t>10. Nagamatsu S, Kami M, Nakata Y. Healthcare safety committee in Japan: mandatory accountability reporting system and punishment. Curr Opin Anaesthesiol. 2009;22(2):199-206.</w:t>
+        <w:t>10. Japan Medical Safety Research Organisation. Annual report on medical accident investigation. Tokyo: JMSR; 2025. Available from: https://www.medsafe.or.jp/</w:t>
       </w:r>
     </w:p>
     <w:p>
@@ -9915,7 +9815,7 @@
           <w:rFonts w:ascii="Times New Roman" w:hAnsi="Times New Roman"/>
           <w:sz w:val="20"/>
         </w:rPr>
-        <w:t>11. Hiyama T, Yoshihara M, Tanaka S, et al. Defensive medicine practices among gastroenterologists in Japan. World J Gastroenterol. 2006;12(47):7671-5.</w:t>
+        <w:t>11. Supreme Court of Japan. Annual report of judicial statistics: medical malpractice litigation. Tokyo: Supreme Court; 2024. Japanese.</w:t>
       </w:r>
     </w:p>
     <w:p>
@@ -9927,7 +9827,7 @@
           <w:rFonts w:ascii="Times New Roman" w:hAnsi="Times New Roman"/>
           <w:sz w:val="20"/>
         </w:rPr>
-        <w:t>12. Morita H. Criminal prosecution and physician supply. Int Rev Law Econ. 2018;55:1-11.</w:t>
+        <w:t>12. Taniguchi K, Watari T, Nagoshi K. Characteristics and trends of medical malpractice claims in Japan between 2006 and 2021. PLoS One. 2024;19(1):e0296155.</w:t>
       </w:r>
     </w:p>
     <w:p>
@@ -9939,7 +9839,7 @@
           <w:rFonts w:ascii="Times New Roman" w:hAnsi="Times New Roman"/>
           <w:sz w:val="20"/>
         </w:rPr>
-        <w:t>13. Japan Medical Safety Research Organisation. Annual report on medical accident investigation. Tokyo: JMSR; 2025. Available from: https://www.medsafe.or.jp/</w:t>
+        <w:t>13. Onishi T. Impact of medical safety incidents on physician workforce and healthcare facility supply across 12 specialties in Japan: an interrupted time series analysis. Preprint. 2025.</w:t>
       </w:r>
     </w:p>
     <w:p>
@@ -9951,7 +9851,7 @@
           <w:rFonts w:ascii="Times New Roman" w:hAnsi="Times New Roman"/>
           <w:sz w:val="20"/>
         </w:rPr>
-        <w:t>14. Supreme Court of Japan. Annual report of judicial statistics: medical malpractice litigation. Tokyo: Supreme Court; 2024. Japanese.</w:t>
+        <w:t>14. Granger CWJ. Investigating causal relations by econometric models and cross-spectral methods. Econometrica. 1969;37(3):424-38.</w:t>
       </w:r>
     </w:p>
     <w:p>
@@ -9963,7 +9863,7 @@
           <w:rFonts w:ascii="Times New Roman" w:hAnsi="Times New Roman"/>
           <w:sz w:val="20"/>
         </w:rPr>
-        <w:t>15. Taniguchi K, Watari T, Nagoshi K. Characteristics and trends of medical malpractice claims in Japan between 2006 and 2021. PLoS One. 2024;19(1):e0296155.</w:t>
+        <w:t>15. Lütkepohl H. New Introduction to Multiple Time Series Analysis. Berlin: Springer; 2005.</w:t>
       </w:r>
     </w:p>
     <w:p>
@@ -9975,7 +9875,7 @@
           <w:rFonts w:ascii="Times New Roman" w:hAnsi="Times New Roman"/>
           <w:sz w:val="20"/>
         </w:rPr>
-        <w:t>16. Onishi T. Impact of medical safety incidents on physician workforce and healthcare facility supply across 12 specialties in Japan: an interrupted time series analysis. Preprint. 2025.</w:t>
+        <w:t>16. Toda HY, Yamamoto T. Statistical inference in vector autoregressions with possibly integrated processes. J Econom. 1995;66(1-2):225-50.</w:t>
       </w:r>
     </w:p>
     <w:p>
@@ -9987,7 +9887,7 @@
           <w:rFonts w:ascii="Times New Roman" w:hAnsi="Times New Roman"/>
           <w:sz w:val="20"/>
         </w:rPr>
-        <w:t>17. Granger CWJ. Investigating causal relations by econometric models and cross-spectral methods. Econometrica. 1969;37(3):424-38.</w:t>
+        <w:t>17. Benchimol EI, Smeeth L, Guttmann A, et al. The REporting of studies Conducted using Observational Routinely-collected health Data (RECORD) statement. PLoS Med. 2015;12(10):e1001885.</w:t>
       </w:r>
     </w:p>
     <w:p>
@@ -9999,7 +9899,7 @@
           <w:rFonts w:ascii="Times New Roman" w:hAnsi="Times New Roman"/>
           <w:sz w:val="20"/>
         </w:rPr>
-        <w:t>18. Lütkepohl H. New Introduction to Multiple Time Series Analysis. Berlin: Springer; 2005.</w:t>
+        <w:t>18. Ministry of Health, Labour and Welfare. Survey of physicians, dentists, and pharmacists. Tokyo: MHLW; 2024. Japanese.</w:t>
       </w:r>
     </w:p>
     <w:p>
@@ -10011,7 +9911,7 @@
           <w:rFonts w:ascii="Times New Roman" w:hAnsi="Times New Roman"/>
           <w:sz w:val="20"/>
         </w:rPr>
-        <w:t>19. Toda HY, Yamamoto T. Statistical inference in vector autoregressions with possibly integrated processes. J Econom. 1995;66(1-2):225-50.</w:t>
+        <w:t>19. Ministry of Health, Labour and Welfare. Survey of medical institutions (dynamic survey). Tokyo: MHLW; 2024. Japanese.</w:t>
       </w:r>
     </w:p>
     <w:p>
@@ -10023,7 +9923,7 @@
           <w:rFonts w:ascii="Times New Roman" w:hAnsi="Times New Roman"/>
           <w:sz w:val="20"/>
         </w:rPr>
-        <w:t>20. Benchimol EI, Smeeth L, Guttmann A, et al. The REporting of studies Conducted using Observational Routinely-collected health Data (RECORD) statement. PLoS Med. 2015;12(10):e1001885.</w:t>
+        <w:t>20. Japan Board of Medical Specialties. Specialist trainee registration statistics. Tokyo: JBMS; 2025. Japanese.</w:t>
       </w:r>
     </w:p>
     <w:p>
@@ -10035,7 +9935,7 @@
           <w:rFonts w:ascii="Times New Roman" w:hAnsi="Times New Roman"/>
           <w:sz w:val="20"/>
         </w:rPr>
-        <w:t>21. Ministry of Health, Labour and Welfare. Survey of physicians, dentists, and pharmacists. Tokyo: MHLW; 2024. Japanese.</w:t>
+        <w:t>21. Hamilton JD. Time Series Analysis. Princeton: Princeton University Press; 1994.</w:t>
       </w:r>
     </w:p>
     <w:p>
@@ -10047,7 +9947,7 @@
           <w:rFonts w:ascii="Times New Roman" w:hAnsi="Times New Roman"/>
           <w:sz w:val="20"/>
         </w:rPr>
-        <w:t>22. Ministry of Health, Labour and Welfare. Survey of medical institutions (dynamic survey). Tokyo: MHLW; 2024. Japanese.</w:t>
+        <w:t>22. Sims CA. Macroeconomics and reality. Econometrica. 1980;48(1):1-48.</w:t>
       </w:r>
     </w:p>
     <w:p>
@@ -10059,7 +9959,7 @@
           <w:rFonts w:ascii="Times New Roman" w:hAnsi="Times New Roman"/>
           <w:sz w:val="20"/>
         </w:rPr>
-        <w:t>23. Japan Board of Medical Specialties. Specialist trainee registration statistics. Tokyo: JBMS; 2025. Japanese.</w:t>
+        <w:t>23. Seabold S, Perktold J. Statsmodels: econometric and statistical modeling with Python. Proc 9th Python Sci Conf. 2010:92-6.</w:t>
       </w:r>
     </w:p>
     <w:p>
@@ -10071,7 +9971,7 @@
           <w:rFonts w:ascii="Times New Roman" w:hAnsi="Times New Roman"/>
           <w:sz w:val="20"/>
         </w:rPr>
-        <w:t>24. Hamilton JD. Time Series Analysis. Princeton: Princeton University Press; 1994.</w:t>
+        <w:t>24. Studdert DM, Mello MM, Sage WM, et al. Defensive medicine among high-risk specialist physicians in a volatile malpractice environment. JAMA. 2005;293(21):2609-17.</w:t>
       </w:r>
     </w:p>
     <w:p>
@@ -10083,7 +9983,7 @@
           <w:rFonts w:ascii="Times New Roman" w:hAnsi="Times New Roman"/>
           <w:sz w:val="20"/>
         </w:rPr>
-        <w:t>25. Sims CA. Macroeconomics and reality. Econometrica. 1980;48(1):1-48.</w:t>
+        <w:t>25. Currie J, MacLeod WB. First do no harm? Tort reform and birth outcomes. Q J Econ. 2008;123(2):795-830.</w:t>
       </w:r>
     </w:p>
     <w:p>
@@ -10095,7 +9995,7 @@
           <w:rFonts w:ascii="Times New Roman" w:hAnsi="Times New Roman"/>
           <w:sz w:val="20"/>
         </w:rPr>
-        <w:t>26. Seabold S, Perktold J. Statsmodels: econometric and statistical modeling with Python. Proc 9th Python Sci Conf. 2010:92-6.</w:t>
+        <w:t>26. Takei T. The ‘Chokubi’ phenomenon: young physicians’ exodus from state service to private medicine in Japan. QJM. 2024;117(12):843-5.</w:t>
       </w:r>
     </w:p>
     <w:p>
@@ -10107,7 +10007,7 @@
           <w:rFonts w:ascii="Times New Roman" w:hAnsi="Times New Roman"/>
           <w:sz w:val="20"/>
         </w:rPr>
-        <w:t>27. Studdert DM, Mello MM, Sage WM, et al. Defensive medicine among high-risk specialist physicians in a volatile malpractice environment. JAMA. 2005;293(21):2609-17.</w:t>
+        <w:t>27. Ministry of Health, Labour and Welfare. Survey of medical institutions 2023: aesthetic surgery clinics. Tokyo: MHLW; 2024. Japanese.</w:t>
       </w:r>
     </w:p>
     <w:p>
@@ -10119,7 +10019,7 @@
           <w:rFonts w:ascii="Times New Roman" w:hAnsi="Times New Roman"/>
           <w:sz w:val="20"/>
         </w:rPr>
-        <w:t>28. Isse T, Nakamura H, Hachisuka K. Turnover of full-time occupational physicians in Japan in the period 2002–2008. Sangyo Eiseigaku Zasshi. 2012;54(5):174-83. Japanese.</w:t>
+        <w:t>28. Koike S, Isse T, Kawaguchi H, et al. Retention among full-time occupational physicians in Japan. Occup Med (Lond). 2019;69(2):139-42.</w:t>
       </w:r>
     </w:p>
     <w:p>
@@ -10131,7 +10031,7 @@
           <w:rFonts w:ascii="Times New Roman" w:hAnsi="Times New Roman"/>
           <w:sz w:val="20"/>
         </w:rPr>
-        <w:t>29. Currie J, MacLeod WB. First do no harm? Tort reform and birth outcomes. Q J Econ. 2008;123(2):795-830.</w:t>
+        <w:t>29. Isse T, Nakamura H, Hachisuka K. Turnover of full-time occupational physicians in Japan in the period 2002–2008. Sangyo Eiseigaku Zasshi. 2012;54(5):174-83. Japanese.</w:t>
       </w:r>
     </w:p>
     <w:p>

</xml_diff>

<commit_message>
Remove ITS ref, fix gaikin double-explanation, renumber citations (28 refs)
Co-Authored-By: Tatsuki Onishi <bougtoir@gmail.com>
</commit_message>
<xml_diff>
--- a/medical_accident_its_analysis/manuscript/jma_manuscript_en.docx
+++ b/medical_accident_its_analysis/manuscript/jma_manuscript_en.docx
@@ -324,7 +324,7 @@
           <w:i w:val="0"/>
           <w:sz w:val="24"/>
         </w:rPr>
-        <w:t>Previous analyses, including our own, relied on interrupted time series (ITS) methodology,</w:t>
+        <w:t>We applied vector autoregression (VAR) models and Granger causality tests—methods widely used in econometrics and increasingly in health policy research</w:t>
       </w:r>
       <w:r>
         <w:rPr>
@@ -334,26 +334,7 @@
           <w:sz w:val="20"/>
           <w:vertAlign w:val="superscript"/>
         </w:rPr>
-        <w:t>13</w:t>
-      </w:r>
-      <w:r>
-        <w:rPr>
-          <w:rFonts w:ascii="Times New Roman" w:hAnsi="Times New Roman"/>
-          <w:b w:val="0"/>
-          <w:i w:val="0"/>
-          <w:sz w:val="24"/>
-        </w:rPr>
-        <w:t xml:space="preserve"> which assumes a discrete exogenous intervention point poorly suited to continuously varying incident counts. We therefore applied vector autoregression (VAR) models and Granger causality tests—methods widely used in econometrics and increasingly in health policy research</w:t>
-      </w:r>
-      <w:r>
-        <w:rPr>
-          <w:rFonts w:ascii="Times New Roman" w:hAnsi="Times New Roman"/>
-          <w:b w:val="0"/>
-          <w:i w:val="0"/>
-          <w:sz w:val="20"/>
-          <w:vertAlign w:val="superscript"/>
-        </w:rPr>
-        <w:t>14–16</w:t>
+        <w:t>13–15</w:t>
       </w:r>
       <w:r>
         <w:rPr>
@@ -415,7 +396,7 @@
           <w:sz w:val="20"/>
           <w:vertAlign w:val="superscript"/>
         </w:rPr>
-        <w:t>17</w:t>
+        <w:t>16</w:t>
       </w:r>
     </w:p>
     <w:p>
@@ -494,7 +475,7 @@
           <w:sz w:val="20"/>
           <w:vertAlign w:val="superscript"/>
         </w:rPr>
-        <w:t>18</w:t>
+        <w:t>17</w:t>
       </w:r>
       <w:r>
         <w:rPr>
@@ -513,7 +494,7 @@
           <w:sz w:val="20"/>
           <w:vertAlign w:val="superscript"/>
         </w:rPr>
-        <w:t>19</w:t>
+        <w:t>18</w:t>
       </w:r>
       <w:r>
         <w:rPr>
@@ -532,7 +513,7 @@
           <w:sz w:val="20"/>
           <w:vertAlign w:val="superscript"/>
         </w:rPr>
-        <w:t>20</w:t>
+        <w:t>19</w:t>
       </w:r>
     </w:p>
     <w:p>
@@ -608,7 +589,7 @@
           <w:sz w:val="20"/>
           <w:vertAlign w:val="superscript"/>
         </w:rPr>
-        <w:t>21</w:t>
+        <w:t>20</w:t>
       </w:r>
       <w:r>
         <w:rPr>
@@ -641,7 +622,7 @@
           <w:sz w:val="20"/>
           <w:vertAlign w:val="superscript"/>
         </w:rPr>
-        <w:t>22</w:t>
+        <w:t>21</w:t>
       </w:r>
       <w:r>
         <w:rPr>
@@ -674,7 +655,7 @@
           <w:sz w:val="20"/>
           <w:vertAlign w:val="superscript"/>
         </w:rPr>
-        <w:t>23</w:t>
+        <w:t>22</w:t>
       </w:r>
       <w:r>
         <w:rPr>
@@ -9271,7 +9252,7 @@
           <w:sz w:val="20"/>
           <w:vertAlign w:val="superscript"/>
         </w:rPr>
-        <w:t>24</w:t>
+        <w:t>23</w:t>
       </w:r>
       <w:r>
         <w:rPr>
@@ -9325,7 +9306,7 @@
           <w:i w:val="0"/>
           <w:sz w:val="24"/>
         </w:rPr>
-        <w:t xml:space="preserve"> While intended to improve physician well-being, the reform has produced several unintended consequences. Restrictions on "gaikin" (moonlighting opportunities)—historically an important income supplement for hospital-based physicians—have reduced the financial attractiveness of demanding specialties. Moreover, deemed self-study, whereby hours exceeding the cap are reclassified as voluntary training rather than labour, has paradoxically increased uncompensated workload for mid-career physicians while failing to improve working conditions for trainees.</w:t>
+        <w:t xml:space="preserve"> While intended to improve physician well-being, the reform has produced several unintended consequences. Restrictions on "gaikin"—historically an important income supplement for hospital-based physicians—have reduced the financial attractiveness of demanding specialties. Moreover, deemed self-study, whereby hours exceeding the cap are reclassified as voluntary training rather than labour, has paradoxically increased uncompensated workload for mid-career physicians while failing to improve working conditions for trainees.</w:t>
       </w:r>
       <w:r>
         <w:rPr>
@@ -9385,7 +9366,7 @@
           <w:sz w:val="20"/>
           <w:vertAlign w:val="superscript"/>
         </w:rPr>
-        <w:t>7,25</w:t>
+        <w:t>7,24</w:t>
       </w:r>
       <w:r>
         <w:rPr>
@@ -9458,7 +9439,7 @@
           <w:sz w:val="20"/>
           <w:vertAlign w:val="superscript"/>
         </w:rPr>
-        <w:t>26,27</w:t>
+        <w:t>25,26</w:t>
       </w:r>
       <w:r>
         <w:rPr>
@@ -9477,7 +9458,7 @@
           <w:sz w:val="20"/>
           <w:vertAlign w:val="superscript"/>
         </w:rPr>
-        <w:t>28,29</w:t>
+        <w:t>27,28</w:t>
       </w:r>
       <w:r>
         <w:rPr>
@@ -9496,7 +9477,7 @@
           <w:sz w:val="20"/>
           <w:vertAlign w:val="superscript"/>
         </w:rPr>
-        <w:t>29</w:t>
+        <w:t>28</w:t>
       </w:r>
       <w:r>
         <w:rPr>
@@ -9839,7 +9820,7 @@
           <w:rFonts w:ascii="Times New Roman" w:hAnsi="Times New Roman"/>
           <w:sz w:val="20"/>
         </w:rPr>
-        <w:t>13. Onishi T. Impact of medical safety incidents on physician workforce and healthcare facility supply across 12 specialties in Japan: an interrupted time series analysis. Preprint. 2025.</w:t>
+        <w:t>13. Granger CWJ. Investigating causal relations by econometric models and cross-spectral methods. Econometrica. 1969;37(3):424-38.</w:t>
       </w:r>
     </w:p>
     <w:p>
@@ -9851,7 +9832,7 @@
           <w:rFonts w:ascii="Times New Roman" w:hAnsi="Times New Roman"/>
           <w:sz w:val="20"/>
         </w:rPr>
-        <w:t>14. Granger CWJ. Investigating causal relations by econometric models and cross-spectral methods. Econometrica. 1969;37(3):424-38.</w:t>
+        <w:t>14. Lütkepohl H. New Introduction to Multiple Time Series Analysis. Berlin: Springer; 2005.</w:t>
       </w:r>
     </w:p>
     <w:p>
@@ -9863,7 +9844,7 @@
           <w:rFonts w:ascii="Times New Roman" w:hAnsi="Times New Roman"/>
           <w:sz w:val="20"/>
         </w:rPr>
-        <w:t>15. Lütkepohl H. New Introduction to Multiple Time Series Analysis. Berlin: Springer; 2005.</w:t>
+        <w:t>15. Toda HY, Yamamoto T. Statistical inference in vector autoregressions with possibly integrated processes. J Econom. 1995;66(1-2):225-50.</w:t>
       </w:r>
     </w:p>
     <w:p>
@@ -9875,7 +9856,7 @@
           <w:rFonts w:ascii="Times New Roman" w:hAnsi="Times New Roman"/>
           <w:sz w:val="20"/>
         </w:rPr>
-        <w:t>16. Toda HY, Yamamoto T. Statistical inference in vector autoregressions with possibly integrated processes. J Econom. 1995;66(1-2):225-50.</w:t>
+        <w:t>16. Benchimol EI, Smeeth L, Guttmann A, et al. The REporting of studies Conducted using Observational Routinely-collected health Data (RECORD) statement. PLoS Med. 2015;12(10):e1001885.</w:t>
       </w:r>
     </w:p>
     <w:p>
@@ -9887,7 +9868,7 @@
           <w:rFonts w:ascii="Times New Roman" w:hAnsi="Times New Roman"/>
           <w:sz w:val="20"/>
         </w:rPr>
-        <w:t>17. Benchimol EI, Smeeth L, Guttmann A, et al. The REporting of studies Conducted using Observational Routinely-collected health Data (RECORD) statement. PLoS Med. 2015;12(10):e1001885.</w:t>
+        <w:t>17. Ministry of Health, Labour and Welfare. Survey of physicians, dentists, and pharmacists. Tokyo: MHLW; 2024. Japanese.</w:t>
       </w:r>
     </w:p>
     <w:p>
@@ -9899,7 +9880,7 @@
           <w:rFonts w:ascii="Times New Roman" w:hAnsi="Times New Roman"/>
           <w:sz w:val="20"/>
         </w:rPr>
-        <w:t>18. Ministry of Health, Labour and Welfare. Survey of physicians, dentists, and pharmacists. Tokyo: MHLW; 2024. Japanese.</w:t>
+        <w:t>18. Ministry of Health, Labour and Welfare. Survey of medical institutions (dynamic survey). Tokyo: MHLW; 2024. Japanese.</w:t>
       </w:r>
     </w:p>
     <w:p>
@@ -9911,7 +9892,7 @@
           <w:rFonts w:ascii="Times New Roman" w:hAnsi="Times New Roman"/>
           <w:sz w:val="20"/>
         </w:rPr>
-        <w:t>19. Ministry of Health, Labour and Welfare. Survey of medical institutions (dynamic survey). Tokyo: MHLW; 2024. Japanese.</w:t>
+        <w:t>19. Japan Board of Medical Specialties. Specialist trainee registration statistics. Tokyo: JBMS; 2025. Japanese.</w:t>
       </w:r>
     </w:p>
     <w:p>
@@ -9923,7 +9904,7 @@
           <w:rFonts w:ascii="Times New Roman" w:hAnsi="Times New Roman"/>
           <w:sz w:val="20"/>
         </w:rPr>
-        <w:t>20. Japan Board of Medical Specialties. Specialist trainee registration statistics. Tokyo: JBMS; 2025. Japanese.</w:t>
+        <w:t>20. Hamilton JD. Time Series Analysis. Princeton: Princeton University Press; 1994.</w:t>
       </w:r>
     </w:p>
     <w:p>
@@ -9935,7 +9916,7 @@
           <w:rFonts w:ascii="Times New Roman" w:hAnsi="Times New Roman"/>
           <w:sz w:val="20"/>
         </w:rPr>
-        <w:t>21. Hamilton JD. Time Series Analysis. Princeton: Princeton University Press; 1994.</w:t>
+        <w:t>21. Sims CA. Macroeconomics and reality. Econometrica. 1980;48(1):1-48.</w:t>
       </w:r>
     </w:p>
     <w:p>
@@ -9947,7 +9928,7 @@
           <w:rFonts w:ascii="Times New Roman" w:hAnsi="Times New Roman"/>
           <w:sz w:val="20"/>
         </w:rPr>
-        <w:t>22. Sims CA. Macroeconomics and reality. Econometrica. 1980;48(1):1-48.</w:t>
+        <w:t>22. Seabold S, Perktold J. Statsmodels: econometric and statistical modeling with Python. Proc 9th Python Sci Conf. 2010:92-6.</w:t>
       </w:r>
     </w:p>
     <w:p>
@@ -9959,7 +9940,7 @@
           <w:rFonts w:ascii="Times New Roman" w:hAnsi="Times New Roman"/>
           <w:sz w:val="20"/>
         </w:rPr>
-        <w:t>23. Seabold S, Perktold J. Statsmodels: econometric and statistical modeling with Python. Proc 9th Python Sci Conf. 2010:92-6.</w:t>
+        <w:t>23. Studdert DM, Mello MM, Sage WM, et al. Defensive medicine among high-risk specialist physicians in a volatile malpractice environment. JAMA. 2005;293(21):2609-17.</w:t>
       </w:r>
     </w:p>
     <w:p>
@@ -9971,7 +9952,7 @@
           <w:rFonts w:ascii="Times New Roman" w:hAnsi="Times New Roman"/>
           <w:sz w:val="20"/>
         </w:rPr>
-        <w:t>24. Studdert DM, Mello MM, Sage WM, et al. Defensive medicine among high-risk specialist physicians in a volatile malpractice environment. JAMA. 2005;293(21):2609-17.</w:t>
+        <w:t>24. Currie J, MacLeod WB. First do no harm? Tort reform and birth outcomes. Q J Econ. 2008;123(2):795-830.</w:t>
       </w:r>
     </w:p>
     <w:p>
@@ -9983,7 +9964,7 @@
           <w:rFonts w:ascii="Times New Roman" w:hAnsi="Times New Roman"/>
           <w:sz w:val="20"/>
         </w:rPr>
-        <w:t>25. Currie J, MacLeod WB. First do no harm? Tort reform and birth outcomes. Q J Econ. 2008;123(2):795-830.</w:t>
+        <w:t>25. Takei T. The ‘Chokubi’ phenomenon: young physicians’ exodus from state service to private medicine in Japan. QJM. 2024;117(12):843-5.</w:t>
       </w:r>
     </w:p>
     <w:p>
@@ -9995,7 +9976,7 @@
           <w:rFonts w:ascii="Times New Roman" w:hAnsi="Times New Roman"/>
           <w:sz w:val="20"/>
         </w:rPr>
-        <w:t>26. Takei T. The ‘Chokubi’ phenomenon: young physicians’ exodus from state service to private medicine in Japan. QJM. 2024;117(12):843-5.</w:t>
+        <w:t>26. Ministry of Health, Labour and Welfare. Survey of medical institutions 2023: aesthetic surgery clinics. Tokyo: MHLW; 2024. Japanese.</w:t>
       </w:r>
     </w:p>
     <w:p>
@@ -10007,7 +9988,7 @@
           <w:rFonts w:ascii="Times New Roman" w:hAnsi="Times New Roman"/>
           <w:sz w:val="20"/>
         </w:rPr>
-        <w:t>27. Ministry of Health, Labour and Welfare. Survey of medical institutions 2023: aesthetic surgery clinics. Tokyo: MHLW; 2024. Japanese.</w:t>
+        <w:t>27. Koike S, Isse T, Kawaguchi H, et al. Retention among full-time occupational physicians in Japan. Occup Med (Lond). 2019;69(2):139-42.</w:t>
       </w:r>
     </w:p>
     <w:p>
@@ -10019,19 +10000,7 @@
           <w:rFonts w:ascii="Times New Roman" w:hAnsi="Times New Roman"/>
           <w:sz w:val="20"/>
         </w:rPr>
-        <w:t>28. Koike S, Isse T, Kawaguchi H, et al. Retention among full-time occupational physicians in Japan. Occup Med (Lond). 2019;69(2):139-42.</w:t>
-      </w:r>
-    </w:p>
-    <w:p>
-      <w:pPr>
-        <w:spacing w:line="480" w:lineRule="auto" w:after="40"/>
-      </w:pPr>
-      <w:r>
-        <w:rPr>
-          <w:rFonts w:ascii="Times New Roman" w:hAnsi="Times New Roman"/>
-          <w:sz w:val="20"/>
-        </w:rPr>
-        <w:t>29. Isse T, Nakamura H, Hachisuka K. Turnover of full-time occupational physicians in Japan in the period 2002–2008. Sangyo Eiseigaku Zasshi. 2012;54(5):174-83. Japanese.</w:t>
+        <w:t>28. Isse T, Nakamura H, Hachisuka K. Turnover of full-time occupational physicians in Japan in the period 2002–2008. Sangyo Eiseigaku Zasshi. 2012;54(5):174-83. Japanese.</w:t>
       </w:r>
     </w:p>
     <w:p>

</xml_diff>

<commit_message>
Polish English: tighten academic register, remove ITS Discussion sentence, reduce AI-sounding prose
Co-Authored-By: Tatsuki Onishi <bougtoir@gmail.com>
</commit_message>
<xml_diff>
--- a/medical_accident_its_analysis/manuscript/jma_manuscript_en.docx
+++ b/medical_accident_its_analysis/manuscript/jma_manuscript_en.docx
@@ -33,7 +33,7 @@
           <w:i w:val="0"/>
           <w:sz w:val="24"/>
         </w:rPr>
-        <w:t>Medical safety incidents may deter physicians from high-risk specialties, yet the temporal dynamics of this relationship remain poorly quantified. In Japan, physician workforce maldistribution has intensified amid the 2024 work-style reform, yet the temporal relationship between safety incidents and specialty-specific workforce supply has not been formally tested.</w:t>
+        <w:t>Medical safety incidents may deter physicians from high-risk specialties, yet the temporal dynamics remain poorly quantified. In Japan, workforce maldistribution has intensified amid the 2024 work-style reform, but no multi-specialty test of predictive causality between incidents and physician supply has been conducted.</w:t>
       </w:r>
     </w:p>
     <w:p>
@@ -77,7 +77,7 @@
           <w:i w:val="0"/>
           <w:sz w:val="24"/>
         </w:rPr>
-        <w:t>Of 47 VAR models, 20 showed significant forward Granger causality (incidents → workforce; P &lt; 0.05). Obstetrics and gynaecology exhibited the strongest association (F = 46.66, P &lt; 0.001). Bidirectional causality was observed in 7 specialty–outcome pairs. Impulse response functions indicated that a litigation shock reduced physician supply for 3–5 years. General surgery physicians are projected to decline by approximately 230 per year through 2033.</w:t>
+        <w:t>Of 47 VAR models, 20 demonstrated significant forward Granger causality (incidents → workforce; P &lt; 0.05). The strongest association was in obstetrics and gynaecology (F = 46.66, P &lt; 0.001). Bidirectional causality emerged in 7 specialty–outcome pairs. Impulse response functions showed that a litigation shock depressed physician supply for 3–5 years. General surgery is projected to lose approximately 230 physicians per year through 2033.</w:t>
       </w:r>
     </w:p>
     <w:p>
@@ -99,7 +99,7 @@
           <w:i w:val="0"/>
           <w:sz w:val="24"/>
         </w:rPr>
-        <w:t>Medical safety incidents Granger-cause reductions in physician supply across most specialties, with effects lasting 3–5 years. Combined with work-style reform constraints, these findings highlight an accelerating workforce crisis requiring integrated policy responses.</w:t>
+        <w:t>Safety incidents Granger-cause specialty-specific workforce decline lasting 3–5 years. Coupled with work-style reform constraints, the resulting reinforcing cycle threatens essential medical services and demands integrated policy intervention.</w:t>
       </w:r>
     </w:p>
     <w:p>
@@ -144,7 +144,7 @@
           <w:i w:val="0"/>
           <w:sz w:val="24"/>
         </w:rPr>
-        <w:t>Japan’s healthcare system faces a deepening crisis of physician workforce maldistribution across specialties and geographic regions.</w:t>
+        <w:t>Japan’s physician workforce has grown steadily to approximately 340,000, yet aggregate expansion masks deepening maldistribution across specialties and regions.</w:t>
       </w:r>
       <w:r>
         <w:rPr>
@@ -163,7 +163,7 @@
           <w:i w:val="0"/>
           <w:sz w:val="24"/>
         </w:rPr>
-        <w:t xml:space="preserve"> While the total number of physicians has grown steadily, reaching approximately 340,000 in 2022, this aggregate growth masks critical shortages in essential specialties such as general surgery, obstetrics, emergency medicine, and paediatrics.</w:t>
+        <w:t xml:space="preserve"> General surgery, obstetrics, emergency medicine, and paediatrics face persistent shortages even as total supply rises.</w:t>
       </w:r>
       <w:r>
         <w:rPr>
@@ -187,7 +187,7 @@
           <w:i w:val="0"/>
           <w:sz w:val="24"/>
         </w:rPr>
-        <w:t>In parallel, the April 2024 implementation of physician work-style reform (time-based overtime caps of 960 hours annually) has restricted "gaikin" (moonlighting opportunities) that previously supplemented income in lower-paying hospital posts.</w:t>
+        <w:t>The April 2024 work-style reform, capping physician overtime at 960 hours annually, has curtailed "gaikin" (moonlighting opportunities) that long supplemented hospital incomes.</w:t>
       </w:r>
       <w:r>
         <w:rPr>
@@ -206,7 +206,7 @@
           <w:i w:val="0"/>
           <w:sz w:val="24"/>
         </w:rPr>
-        <w:t xml:space="preserve"> These regulatory changes may interact with safety-incident-driven workforce dynamics, yet existing evidence is limited to single-event, single-specialty case studies.</w:t>
+        <w:t xml:space="preserve"> How these regulatory constraints interact with incident-driven workforce dynamics remains untested beyond single-event case studies.</w:t>
       </w:r>
     </w:p>
     <w:p>
@@ -220,7 +220,7 @@
           <w:i w:val="0"/>
           <w:sz w:val="24"/>
         </w:rPr>
-        <w:t>The role of medical safety incidents as a push factor driving physicians away from high-risk specialties has been discussed since the landmark 2004 Fukushima obstetrics prosecution, in which an obstetrician was arrested following a maternal death during caesarean section.</w:t>
+        <w:t>Safety incidents as a determinant of specialty choice gained prominence after the 2004 Fukushima obstetrics prosecution, in which an obstetrician was arrested following a maternal death during caesarean section.</w:t>
       </w:r>
       <w:r>
         <w:rPr>
@@ -239,7 +239,7 @@
           <w:i w:val="0"/>
           <w:sz w:val="24"/>
         </w:rPr>
-        <w:t xml:space="preserve"> Morita estimated a 13% decrease in obstetricians in the affected prefecture using difference-in-differences analysis.</w:t>
+        <w:t xml:space="preserve"> Morita reported a 13% decline in obstetricians in the affected prefecture using difference-in-differences.</w:t>
       </w:r>
       <w:r>
         <w:rPr>
@@ -258,7 +258,7 @@
           <w:i w:val="0"/>
           <w:sz w:val="24"/>
         </w:rPr>
-        <w:t xml:space="preserve"> However, this analysis was limited to a single event, specialty, and geographic area. Broader evidence linking incident trends to workforce dynamics across multiple specialties remains scarce.</w:t>
+        <w:t xml:space="preserve"> That analysis, however, addressed a single event in one specialty and one region; broader multi-specialty evidence linking incident burden to workforce dynamics is lacking.</w:t>
       </w:r>
     </w:p>
     <w:p>
@@ -272,7 +272,7 @@
           <w:i w:val="0"/>
           <w:sz w:val="24"/>
         </w:rPr>
-        <w:t>Japan possesses two complementary national data sources on medical safety incidents: the Japan Medical Safety Research Organisation (JMSR) mandatory reporting system established in 2015,</w:t>
+        <w:t>Japan offers two complementary national incident series: the Japan Medical Safety Research Organisation (JMSR) mandatory reports (from 2015)</w:t>
       </w:r>
       <w:r>
         <w:rPr>
@@ -291,7 +291,7 @@
           <w:i w:val="0"/>
           <w:sz w:val="24"/>
         </w:rPr>
-        <w:t xml:space="preserve"> and the Supreme Court annual statistics on medical malpractice litigation by specialty.</w:t>
+        <w:t xml:space="preserve"> and Supreme Court malpractice litigation statistics by specialty.</w:t>
       </w:r>
       <w:r>
         <w:rPr>
@@ -310,7 +310,7 @@
           <w:i w:val="0"/>
           <w:sz w:val="24"/>
         </w:rPr>
-        <w:t xml:space="preserve"> Combined with biennial national physician surveys and annual facility registrations, these data enable a systematic, multi-specialty analysis.</w:t>
+        <w:t xml:space="preserve"> Paired with biennial physician surveys and annual facility registrations, these data permit a systematic multi-specialty analysis.</w:t>
       </w:r>
     </w:p>
     <w:p>
@@ -324,7 +324,7 @@
           <w:i w:val="0"/>
           <w:sz w:val="24"/>
         </w:rPr>
-        <w:t>We applied vector autoregression (VAR) models and Granger causality tests—methods widely used in econometrics and increasingly in health policy research</w:t>
+        <w:t>Here we apply vector autoregression (VAR) and Granger causality testing</w:t>
       </w:r>
       <w:r>
         <w:rPr>
@@ -343,7 +343,7 @@
           <w:i w:val="0"/>
           <w:sz w:val="24"/>
         </w:rPr>
-        <w:t>—to formally test whether medical safety incidents temporally precede and predict changes in specialty-specific physician and facility counts.</w:t>
+        <w:t>—established econometric tools for predictive-causality inference—to determine whether incident trends temporally precede changes in specialty-specific physician and facility counts across 12 specialties over up to 20 years.</w:t>
       </w:r>
     </w:p>
     <w:p>
@@ -386,7 +386,7 @@
           <w:i w:val="0"/>
           <w:sz w:val="24"/>
         </w:rPr>
-        <w:t>We conducted a secondary analysis of routinely collected national administrative data from Japan using bivariate VAR models and Granger causality tests. This study is reported in accordance with the RECORD (REporting of studies Conducted using Observational Routinely-collected health Data) statement.</w:t>
+        <w:t>This is a secondary analysis of routinely collected national administrative data using bivariate VAR models and Granger causality tests, reported in accordance with the RECORD (REporting of studies Conducted using Observational Routinely-collected health Data) statement.</w:t>
       </w:r>
       <w:r>
         <w:rPr>
@@ -579,7 +579,7 @@
           <w:i w:val="0"/>
           <w:sz w:val="24"/>
         </w:rPr>
-        <w:t>Granger causality was tested in both directions using F-tests on lagged coefficients.</w:t>
+        <w:t>Granger causality was tested bidirectionally using F-tests on lagged coefficients.</w:t>
       </w:r>
       <w:r>
         <w:rPr>
@@ -598,7 +598,7 @@
           <w:i w:val="0"/>
           <w:sz w:val="24"/>
         </w:rPr>
-        <w:t xml:space="preserve"> The null hypothesis for the forward test is that lagged incident counts do not improve prediction of the workforce outcome. Significance was set at P &lt; 0.05.</w:t>
+        <w:t xml:space="preserve"> The forward null hypothesis is that lagged incident counts do not improve prediction of the workforce outcome; significance was set at P &lt; 0.05.</w:t>
       </w:r>
     </w:p>
     <w:p>
@@ -645,7 +645,7 @@
           <w:i w:val="0"/>
           <w:sz w:val="24"/>
         </w:rPr>
-        <w:t>For specialist trainees (8 years), detrended Pearson correlations between JMSR incidents and enrolment were computed. All analyses used Python 3.10 with statsmodels 0.14.</w:t>
+        <w:t>For specialist trainees (8 annual observations), detrended Pearson correlations between JMSR incidents and enrolment were computed. Analyses used Python 3.10 with statsmodels 0.14.</w:t>
       </w:r>
       <w:r>
         <w:rPr>
@@ -664,7 +664,7 @@
           <w:i w:val="0"/>
           <w:sz w:val="24"/>
         </w:rPr>
-        <w:t xml:space="preserve"> Code and data are available at https://github.com/bougtoir/medical-accident-its-analysis.</w:t>
+        <w:t xml:space="preserve"> Code and data are deposited at https://github.com/bougtoir/medical-accident-its-analysis.</w:t>
       </w:r>
     </w:p>
     <w:p>
@@ -733,7 +733,7 @@
           <w:i w:val="0"/>
           <w:sz w:val="24"/>
         </w:rPr>
-        <w:t>Between 2015 and 2025, the JMSR received 3,860 reports across the 12 specialties, with general surgery (n = 520), internal medicine (n = 479), and orthopaedic surgery (n = 310) recording the highest volumes. Medical malpractice litigation declined from 1,139 cases in 2004 to 746 in 2023 overall, although trends varied substantially by specialty (Figure 1).</w:t>
+        <w:t>Over the study period the JMSR received 3,860 reports across 12 specialties (2015–2025); general surgery (n = 520), internal medicine (n = 479), and orthopaedic surgery (n = 310) contributed the largest volumes. Malpractice litigation declined from 1,139 cases (2004) to 746 (2023) nationally, though specialty-level trajectories diverged (Figure 1).</w:t>
       </w:r>
     </w:p>
     <w:p>
@@ -7959,7 +7959,7 @@
           <w:i w:val="0"/>
           <w:sz w:val="24"/>
         </w:rPr>
-        <w:t>Figure 2 shows IRFs for physician counts in response to a one-unit litigation shock for six key specialties. Obstetrics and gynaecology demonstrated a sustained negative response peaking at 2–3 years and persisting for approximately 5 years. General surgery showed a similar pattern attenuating by year 4. Facility-count IRFs are shown in Figure 3.</w:t>
+        <w:t>Figure 2 displays physician-count IRFs following a one-unit litigation shock for six key specialties. Obstetrics and gynaecology exhibited a sustained negative response peaking at 2–3 years and persisting approximately 5 years; general surgery followed a similar trajectory attenuating by year 4. Facility-count IRFs appear in Figure 3.</w:t>
       </w:r>
     </w:p>
     <w:p>
@@ -9164,7 +9164,19 @@
           <w:i w:val="0"/>
           <w:sz w:val="24"/>
         </w:rPr>
-        <w:t>This study provides the first multi-specialty application of Granger causality testing to the relationship between medical safety incidents and physician workforce dynamics. Litigation statistics Granger-caused physician counts in 9 of 12 specialties and facility counts in 9 of 12, with obstetrics and gynaecology showing the strongest association (F = 46.66, P &lt; 0.001).</w:t>
+        <w:t>Litigation statistics Granger-caused physician counts in 9 of 12 specialties and facility counts in 9 of 12; obstetrics and gynaecology showed the strongest association (F = 46.66, P &lt; 0.001). These results establish, for the first time across multiple specialties simultaneously, that incident burden carries predictive information for subsequent workforce change.</w:t>
+      </w:r>
+    </w:p>
+    <w:p>
+      <w:pPr>
+        <w:pStyle w:val="Heading2"/>
+      </w:pPr>
+      <w:r>
+        <w:rPr>
+          <w:rFonts w:ascii="Times New Roman" w:hAnsi="Times New Roman"/>
+          <w:color w:val="000000"/>
+        </w:rPr>
+        <w:t>Bidirectional causality</w:t>
       </w:r>
     </w:p>
     <w:p>
@@ -9178,52 +9190,7 @@
           <w:i w:val="0"/>
           <w:sz w:val="24"/>
         </w:rPr>
-        <w:t>The VAR/Granger framework addresses key limitations of prior ITS analyses:</w:t>
-      </w:r>
-      <w:r>
-        <w:rPr>
-          <w:rFonts w:ascii="Times New Roman" w:hAnsi="Times New Roman"/>
-          <w:b w:val="0"/>
-          <w:i w:val="0"/>
-          <w:sz w:val="20"/>
-          <w:vertAlign w:val="superscript"/>
-        </w:rPr>
-        <w:t>13</w:t>
-      </w:r>
-      <w:r>
-        <w:rPr>
-          <w:rFonts w:ascii="Times New Roman" w:hAnsi="Times New Roman"/>
-          <w:b w:val="0"/>
-          <w:i w:val="0"/>
-          <w:sz w:val="24"/>
-        </w:rPr>
-        <w:t xml:space="preserve"> it does not require an exogenous intervention point, provides formal predictive-causality tests, controls for shared trends through stationarity testing, and generates multivariate forecasts grounded in estimated dynamics.</w:t>
-      </w:r>
-    </w:p>
-    <w:p>
-      <w:pPr>
-        <w:pStyle w:val="Heading2"/>
-      </w:pPr>
-      <w:r>
-        <w:rPr>
-          <w:rFonts w:ascii="Times New Roman" w:hAnsi="Times New Roman"/>
-          <w:color w:val="000000"/>
-        </w:rPr>
-        <w:t>Bidirectional causality and the vicious cycle</w:t>
-      </w:r>
-    </w:p>
-    <w:p>
-      <w:pPr>
-        <w:spacing w:after="120" w:line="480" w:lineRule="auto"/>
-      </w:pPr>
-      <w:r>
-        <w:rPr>
-          <w:rFonts w:ascii="Times New Roman" w:hAnsi="Times New Roman"/>
-          <w:b w:val="0"/>
-          <w:i w:val="0"/>
-          <w:sz w:val="24"/>
-        </w:rPr>
-        <w:t>Bidirectional Granger causality in 7 specialty–outcome combinations suggests a reinforcing cycle. Forward causality (incidents → workforce decline) reflects "incident avoidance": high-profile safety events deter specialty entry and accelerate exit.</w:t>
+        <w:t>Bidirectional Granger causality in 7 specialty–outcome pairs points to a reinforcing cycle. The forward pathway (incidents → workforce decline) is consistent with incident-avoidance behaviour: high-profile events deter specialty entry and hasten exit.</w:t>
       </w:r>
       <w:r>
         <w:rPr>
@@ -9242,7 +9209,7 @@
           <w:i w:val="0"/>
           <w:sz w:val="24"/>
         </w:rPr>
-        <w:t xml:space="preserve"> Reverse causality (workforce decline → incidents) reflects an "overwork" pathway: fewer physicians per caseload increases fatigue, reduces supervision, and raises incident risk.</w:t>
+        <w:t xml:space="preserve"> The reverse pathway (workforce decline → incidents) accords with the overwork hypothesis—fewer physicians per caseload raises fatigue and incident risk.</w:t>
       </w:r>
       <w:r>
         <w:rPr>
@@ -9261,7 +9228,7 @@
           <w:i w:val="0"/>
           <w:sz w:val="24"/>
         </w:rPr>
-        <w:t xml:space="preserve"> The coexistence of both pathways in obstetrics, paediatrics, and general surgery defines the specialties most vulnerable to self-perpetuating decline.</w:t>
+        <w:t xml:space="preserve"> That both directions reach significance in obstetrics, paediatrics, and general surgery identifies these specialties as most susceptible to self-perpetuating decline.</w:t>
       </w:r>
     </w:p>
     <w:p>
@@ -9273,7 +9240,7 @@
           <w:rFonts w:ascii="Times New Roman" w:hAnsi="Times New Roman"/>
           <w:color w:val="000000"/>
         </w:rPr>
-        <w:t>Context: work-style reform</w:t>
+        <w:t>Work-style reform as a compounding factor</w:t>
       </w:r>
     </w:p>
     <w:p>
@@ -9287,7 +9254,7 @@
           <w:i w:val="0"/>
           <w:sz w:val="24"/>
         </w:rPr>
-        <w:t>Our findings must be interpreted against the backdrop of Japan’s evolving physician labour market. The April 2024 work-style reform caps annual overtime at 960 hours (A-level) with transitional exceptions (B/C-level at 1,860 hours).</w:t>
+        <w:t>These incident-driven dynamics operate within a labour market reshaped by the April 2024 work-style reform (960-hour annual overtime cap, A-level; 1,860-hour transitional B/C-level).</w:t>
       </w:r>
       <w:r>
         <w:rPr>
@@ -9306,7 +9273,7 @@
           <w:i w:val="0"/>
           <w:sz w:val="24"/>
         </w:rPr>
-        <w:t xml:space="preserve"> While intended to improve physician well-being, the reform has produced several unintended consequences. Restrictions on "gaikin"—historically an important income supplement for hospital-based physicians—have reduced the financial attractiveness of demanding specialties. Moreover, deemed self-study, whereby hours exceeding the cap are reclassified as voluntary training rather than labour, has paradoxically increased uncompensated workload for mid-career physicians while failing to improve working conditions for trainees.</w:t>
+        <w:t xml:space="preserve"> Restrictions on "gaikin" have eroded the income supplement that historically offset demanding hospital posts, while deemed self-study—hours reclassified as voluntary training rather than compensable labour—has shifted workload onto mid-career physicians without relieving trainee burden.</w:t>
       </w:r>
       <w:r>
         <w:rPr>
@@ -9318,11 +9285,6 @@
         </w:rPr>
         <w:t>6</w:t>
       </w:r>
-    </w:p>
-    <w:p>
-      <w:pPr>
-        <w:spacing w:after="120" w:line="480" w:lineRule="auto"/>
-      </w:pPr>
       <w:r>
         <w:rPr>
           <w:rFonts w:ascii="Times New Roman" w:hAnsi="Times New Roman"/>
@@ -9330,7 +9292,7 @@
           <w:i w:val="0"/>
           <w:sz w:val="24"/>
         </w:rPr>
-        <w:t>Our Granger causality results illuminate the push side of this equation: safety incidents actively drive physicians away from high-risk specialties over a 3–5 year horizon. When combined with the reduced financial incentives imposed by work-style reform, the result is an accelerating workforce crisis in precisely those specialties that society most needs—surgery, obstetrics, emergency medicine, and paediatrics.</w:t>
+        <w:t xml:space="preserve"> The 3–5 year incident-response horizon identified by our IRFs thus coincides with a period of contracting financial incentives for the very specialties most affected.</w:t>
       </w:r>
     </w:p>
     <w:p>
@@ -9356,7 +9318,7 @@
           <w:i w:val="0"/>
           <w:sz w:val="24"/>
         </w:rPr>
-        <w:t>Breaking the vicious cycle requires interventions targeting both pathways. On the push side, improved post-incident support, no-fault compensation systems, and balanced media reporting could reduce the deterrent effect of safety events.</w:t>
+        <w:t>Disrupting the reinforcing cycle requires action on both pathways. On the push side, structured post-incident support, no-fault compensation mechanisms, and proportionate media reporting may blunt the deterrent signal of safety events.</w:t>
       </w:r>
       <w:r>
         <w:rPr>
@@ -9375,7 +9337,7 @@
           <w:i w:val="0"/>
           <w:sz w:val="24"/>
         </w:rPr>
-        <w:t xml:space="preserve"> On the pull side, the Ministry of Health, Labour and Welfare’s 2024 draft measures to restrict new clinic openings in physician-surplus areas may function to attenuate the outflow from essential specialties. The IRF results, showing 3–5 year effect duration, define a critical intervention window during which combined regulatory and incentive-based policies could be most effective.</w:t>
+        <w:t xml:space="preserve"> On the pull side, the 2024 draft restrictions on new clinic openings in physician-surplus areas may function to attenuate outflow from essential specialties. The 3–5 year effect duration estimated here defines a policy window within which combined regulatory and incentive-based measures could realistically alter trajectories.</w:t>
       </w:r>
     </w:p>
     <w:p>
@@ -9389,7 +9351,7 @@
           <w:i w:val="0"/>
           <w:sz w:val="24"/>
         </w:rPr>
-        <w:t>Workforce planning models should incorporate the temporal lag parameters estimated here. The projected decline in general surgery (−230 physicians/year) and facilities (−310/year) demands urgent policy attention, particularly given the reform-driven constraints on existing workforce capacity.</w:t>
+        <w:t>The projected contraction in general surgery (−230 physicians/year; −310 facilities/year) warrants particular attention given concurrent reform-driven capacity constraints. Workforce planning models should incorporate the lag parameters estimated here.</w:t>
       </w:r>
     </w:p>
     <w:p>
@@ -9415,7 +9377,7 @@
           <w:i w:val="0"/>
           <w:sz w:val="24"/>
         </w:rPr>
-        <w:t>Strengths include population-level data from mandatory national registries across 12 specialties over up to 20 years, and the application of VAR/Granger methodology suited to continuously varying exposures.</w:t>
+        <w:t>Strengths of this study include population-level coverage from mandatory national registries across 12 specialties over up to 20 years, and a VAR/Granger framework suited to continuously varying exposures without requiring an assumed intervention point.</w:t>
       </w:r>
     </w:p>
     <w:p>
@@ -9429,7 +9391,7 @@
           <w:i w:val="0"/>
           <w:sz w:val="24"/>
         </w:rPr>
-        <w:t>Limitations include the ecological study design precluding individual-level causal inference; biennial physician data requiring interpolation; limited power in the JMSR series (11 years); and unmeasured confounders including demographic shifts, the 2004 postgraduate training reform, and the direct effects of work-style reform itself (which overlaps temporally with the most recent data points). Importantly, our 12-specialty framework does not capture career paths that fall outside conventional specialty registration, notably aesthetic medicine</w:t>
+        <w:t>Several limitations warrant consideration. The ecological design precludes individual-level causal inference. Biennial physician data required interpolation, potentially smoothing abrupt transitions. The JMSR series spans only 11 years, limiting statistical power. Unmeasured confounders—demographic shifts, the 2004 postgraduate training reform, and the direct effects of work-style reform (temporally overlapping the most recent observations)—may bias estimates. Notably, our 12-specialty framework does not capture career paths outside conventional specialty registration, such as aesthetic medicine</w:t>
       </w:r>
       <w:r>
         <w:rPr>
@@ -9467,7 +9429,7 @@
           <w:i w:val="0"/>
           <w:sz w:val="24"/>
         </w:rPr>
-        <w:t xml:space="preserve"> The growing migration of early-career physicians into these non-traditionally-classified sectors may confound our estimates; to the extent that pull-driven exits correlate temporally with incident trends, our models may overestimate the incident-attributable component of workforce decline. Low retention among occupational physicians (55–65% turnover within 2 years)</w:t>
+        <w:t xml:space="preserve"> To the extent that migration into these sectors correlates temporally with incident trends, our models may overestimate the incident-attributable component of workforce decline. Low retention among occupational physicians (55–65% turnover within 2 years)</w:t>
       </w:r>
       <w:r>
         <w:rPr>
@@ -9486,7 +9448,7 @@
           <w:i w:val="0"/>
           <w:sz w:val="24"/>
         </w:rPr>
-        <w:t xml:space="preserve"> further complicates workforce planning assumptions.</w:t>
+        <w:t xml:space="preserve"> further complicates workforce projections.</w:t>
       </w:r>
     </w:p>
     <w:p>
@@ -9512,7 +9474,7 @@
           <w:i w:val="0"/>
           <w:sz w:val="24"/>
         </w:rPr>
-        <w:t>Medical safety incidents in Japan Granger-cause reductions in specialty-specific physician supply in 9 of 12 specialties, with effects persisting for 3–5 years. Bidirectional causality in obstetrics, paediatrics, and general surgery suggests a self-reinforcing shortage–incident cycle. In the context of work-style reform and career paths outside conventional specialty frameworks, these temporal dynamics pose an urgent threat to essential medical services. Integrated policy responses addressing both the push of safety incidents and the pull of alternative career paths are needed.</w:t>
+        <w:t>Safety incidents Granger-cause reductions in physician supply in 9 of 12 specialties, with effects persisting 3–5 years. Bidirectional causality in obstetrics, paediatrics, and general surgery points to a self-reinforcing shortage–incident cycle that, compounded by work-style reform and the emergence of career paths outside conventional specialty frameworks, poses a credible threat to essential medical services.</w:t>
       </w:r>
     </w:p>
     <w:p>

</xml_diff>

<commit_message>
Switch RECORD to STROBE, add STROBE checklist supplementary file
Co-Authored-By: Tatsuki Onishi <bougtoir@gmail.com>
</commit_message>
<xml_diff>
--- a/medical_accident_its_analysis/manuscript/jma_manuscript_en.docx
+++ b/medical_accident_its_analysis/manuscript/jma_manuscript_en.docx
@@ -386,7 +386,7 @@
           <w:i w:val="0"/>
           <w:sz w:val="24"/>
         </w:rPr>
-        <w:t>This is a secondary analysis of routinely collected national administrative data using bivariate VAR models and Granger causality tests, reported in accordance with the RECORD (REporting of studies Conducted using Observational Routinely-collected health Data) statement.</w:t>
+        <w:t>This is a secondary analysis of routinely collected national administrative data using bivariate VAR models and Granger causality tests, reported in accordance with the STROBE (Strengthening the Reporting of Observational Studies in Epidemiology) statement for cross-sectional studies.</w:t>
       </w:r>
       <w:r>
         <w:rPr>
@@ -9818,7 +9818,7 @@
           <w:rFonts w:ascii="Times New Roman" w:hAnsi="Times New Roman"/>
           <w:sz w:val="20"/>
         </w:rPr>
-        <w:t>16. Benchimol EI, Smeeth L, Guttmann A, et al. The REporting of studies Conducted using Observational Routinely-collected health Data (RECORD) statement. PLoS Med. 2015;12(10):e1001885.</w:t>
+        <w:t>16. von Elm E, Altman DG, Egger M, et al. The Strengthening the Reporting of Observational Studies in Epidemiology (STROBE) statement: guidelines for reporting observational studies. Lancet. 2007;370(9596):1453-7.</w:t>
       </w:r>
     </w:p>
     <w:p>

</xml_diff>

<commit_message>
Discussion: emphasise litigation vs occurrence contrast, early dispute resolution as policy lever
Co-Authored-By: Tatsuki Onishi <bougtoir@gmail.com>
</commit_message>
<xml_diff>
--- a/medical_accident_its_analysis/manuscript/jma_manuscript_en.docx
+++ b/medical_accident_its_analysis/manuscript/jma_manuscript_en.docx
@@ -9164,7 +9164,7 @@
           <w:i w:val="0"/>
           <w:sz w:val="24"/>
         </w:rPr>
-        <w:t>Litigation statistics Granger-caused physician counts in 9 of 12 specialties and facility counts in 9 of 12; obstetrics and gynaecology showed the strongest association (F = 46.66, P &lt; 0.001). These results establish, for the first time across multiple specialties simultaneously, that incident burden carries predictive information for subsequent workforce change.</w:t>
+        <w:t>Litigation statistics Granger-caused physician counts in 9 of 12 specialties and facility counts in 9 of 12; obstetrics and gynaecology showed the strongest association (F = 46.66, P &lt; 0.001). By contrast, JMSR incident reports—which capture adverse events irrespective of legal proceedings—reached significance in only 2 of 23 models (general surgery and psychiatry), partly reflecting the shorter series (11 versus 20 years) but also suggesting that the litigation process itself, rather than incident occurrence alone, is the stronger predictor of workforce change.</w:t>
       </w:r>
     </w:p>
     <w:p>
@@ -9318,7 +9318,7 @@
           <w:i w:val="0"/>
           <w:sz w:val="24"/>
         </w:rPr>
-        <w:t>Disrupting the reinforcing cycle requires action on both pathways. On the push side, structured post-incident support, no-fault compensation mechanisms, and proportionate media reporting may blunt the deterrent signal of safety events.</w:t>
+        <w:t>That litigation-based models dominate the results carries a constructive corollary: if disputes are resolved before reaching court—through early mediation, alternative dispute resolution, or no-fault compensation—the workforce signal may be substantially attenuated. Strengthening these mechanisms, alongside structured post-incident support and proportionate media reporting, could blunt the deterrent effect that currently drives physicians from high-risk specialties.</w:t>
       </w:r>
       <w:r>
         <w:rPr>
@@ -9330,6 +9330,11 @@
         </w:rPr>
         <w:t>7,24</w:t>
       </w:r>
+    </w:p>
+    <w:p>
+      <w:pPr>
+        <w:spacing w:after="120" w:line="480" w:lineRule="auto"/>
+      </w:pPr>
       <w:r>
         <w:rPr>
           <w:rFonts w:ascii="Times New Roman" w:hAnsi="Times New Roman"/>
@@ -9337,7 +9342,7 @@
           <w:i w:val="0"/>
           <w:sz w:val="24"/>
         </w:rPr>
-        <w:t xml:space="preserve"> On the pull side, the 2024 draft restrictions on new clinic openings in physician-surplus areas may function to attenuate outflow from essential specialties. The 3–5 year effect duration estimated here defines a policy window within which combined regulatory and incentive-based measures could realistically alter trajectories.</w:t>
+        <w:t>On the pull side, the 2024 draft restrictions on new clinic openings in physician-surplus areas may function to attenuate outflow from essential specialties. The 3–5 year effect duration estimated by our IRFs defines a policy window within which combined regulatory and incentive-based measures could realistically alter trajectories.</w:t>
       </w:r>
     </w:p>
     <w:p>

</xml_diff>

<commit_message>
Revise Discussion: series-length sensitivity, multi-lever policy implications (incentives, safety culture, staffing, reform)
Co-Authored-By: Tatsuki Onishi <bougtoir@gmail.com>
</commit_message>
<xml_diff>
--- a/medical_accident_its_analysis/manuscript/jma_manuscript_en.docx
+++ b/medical_accident_its_analysis/manuscript/jma_manuscript_en.docx
@@ -9164,7 +9164,7 @@
           <w:i w:val="0"/>
           <w:sz w:val="24"/>
         </w:rPr>
-        <w:t>Litigation statistics Granger-caused physician counts in 9 of 12 specialties and facility counts in 9 of 12; obstetrics and gynaecology showed the strongest association (F = 46.66, P &lt; 0.001). By contrast, JMSR incident reports—which capture adverse events irrespective of legal proceedings—reached significance in only 2 of 23 models (general surgery and psychiatry), partly reflecting the shorter series (11 versus 20 years) but also suggesting that the litigation process itself, rather than incident occurrence alone, is the stronger predictor of workforce change.</w:t>
+        <w:t>Using the full 20-year litigation series, forward Granger causality reached significance in 18 of 24 models (9 of 12 specialties for both physician and facility counts); obstetrics and gynaecology showed the strongest association (F = 46.66, P &lt; 0.001). The 11-year JMSR series yielded only 2 significant models (general surgery and psychiatry). A sensitivity analysis restricting litigation data to the overlapping 2015–2023 window (9 years) reduced significant models from 18 to 4, indicating that the apparent superiority of litigation-based results largely reflects greater statistical power afforded by the longer series rather than a qualitative difference between data sources.</w:t>
       </w:r>
     </w:p>
     <w:p>
@@ -9318,17 +9318,7 @@
           <w:i w:val="0"/>
           <w:sz w:val="24"/>
         </w:rPr>
-        <w:t>That litigation-based models dominate the results carries a constructive corollary: if disputes are resolved before reaching court—through early mediation, alternative dispute resolution, or no-fault compensation—the workforce signal may be substantially attenuated. Strengthening these mechanisms, alongside structured post-incident support and proportionate media reporting, could blunt the deterrent effect that currently drives physicians from high-risk specialties.</w:t>
-      </w:r>
-      <w:r>
-        <w:rPr>
-          <w:rFonts w:ascii="Times New Roman" w:hAnsi="Times New Roman"/>
-          <w:b w:val="0"/>
-          <w:i w:val="0"/>
-          <w:sz w:val="20"/>
-          <w:vertAlign w:val="superscript"/>
-        </w:rPr>
-        <w:t>7,24</w:t>
+        <w:t>Because both incident definitions—occurrence-based and litigation-based—predict workforce decline when series length is adequate, interventions should target the common upstream determinant: the safety event itself and its professional consequences. Several complementary levers emerge from our results.</w:t>
       </w:r>
     </w:p>
     <w:p>
@@ -9342,7 +9332,45 @@
           <w:i w:val="0"/>
           <w:sz w:val="24"/>
         </w:rPr>
-        <w:t>On the pull side, the 2024 draft restrictions on new clinic openings in physician-surplus areas may function to attenuate outflow from essential specialties. The 3–5 year effect duration estimated by our IRFs defines a policy window within which combined regulatory and incentive-based measures could realistically alter trajectories.</w:t>
+        <w:t>First, economic incentives for high-risk specialties (enhanced remuneration, training stipends, rural service allowances) address the most proximate driver of specialty avoidance.</w:t>
+      </w:r>
+      <w:r>
+        <w:rPr>
+          <w:rFonts w:ascii="Times New Roman" w:hAnsi="Times New Roman"/>
+          <w:b w:val="0"/>
+          <w:i w:val="0"/>
+          <w:sz w:val="20"/>
+          <w:vertAlign w:val="superscript"/>
+        </w:rPr>
+        <w:t>24</w:t>
+      </w:r>
+      <w:r>
+        <w:rPr>
+          <w:rFonts w:ascii="Times New Roman" w:hAnsi="Times New Roman"/>
+          <w:b w:val="0"/>
+          <w:i w:val="0"/>
+          <w:sz w:val="24"/>
+        </w:rPr>
+        <w:t xml:space="preserve"> Second, fostering a non-punitive safety culture—structured post-incident psychological support, transparent root-cause analysis, and proportionate media reporting—may attenuate the deterrent signal of adverse events.</w:t>
+      </w:r>
+      <w:r>
+        <w:rPr>
+          <w:rFonts w:ascii="Times New Roman" w:hAnsi="Times New Roman"/>
+          <w:b w:val="0"/>
+          <w:i w:val="0"/>
+          <w:sz w:val="20"/>
+          <w:vertAlign w:val="superscript"/>
+        </w:rPr>
+        <w:t>7</w:t>
+      </w:r>
+      <w:r>
+        <w:rPr>
+          <w:rFonts w:ascii="Times New Roman" w:hAnsi="Times New Roman"/>
+          <w:b w:val="0"/>
+          <w:i w:val="0"/>
+          <w:sz w:val="24"/>
+        </w:rPr>
+        <w:t xml:space="preserve"> Third, the reverse-causality pathway (fewer physicians → more incidents) implies that minimum staffing thresholds in specialties exhibiting bidirectional causality (obstetrics, paediatrics, general surgery) could interrupt the reinforcing cycle before it becomes self-sustaining. Fourth, effective implementation of work-style reform—including correction of deemed self-study practices and equitable redistribution of workload—is essential to prevent the reform itself from accelerating exit from demanding specialties.</w:t>
       </w:r>
     </w:p>
     <w:p>
@@ -9356,7 +9384,7 @@
           <w:i w:val="0"/>
           <w:sz w:val="24"/>
         </w:rPr>
-        <w:t>The projected contraction in general surgery (−230 physicians/year; −310 facilities/year) warrants particular attention given concurrent reform-driven capacity constraints. Workforce planning models should incorporate the lag parameters estimated here.</w:t>
+        <w:t>The 3–5 year effect duration estimated by our IRFs defines a critical monitoring window: targeted surveillance and support in the years following a major safety event may prevent transient workforce shocks from consolidating into permanent losses. The projected contraction in general surgery (−230 physicians/year; −310 facilities/year) underscores the urgency of deploying these measures concurrently rather than sequentially.</w:t>
       </w:r>
     </w:p>
     <w:p>
@@ -9396,7 +9424,7 @@
           <w:i w:val="0"/>
           <w:sz w:val="24"/>
         </w:rPr>
-        <w:t>Several limitations warrant consideration. The ecological design precludes individual-level causal inference. Biennial physician data required interpolation, potentially smoothing abrupt transitions. The JMSR series spans only 11 years, limiting statistical power. Unmeasured confounders—demographic shifts, the 2004 postgraduate training reform, and the direct effects of work-style reform (temporally overlapping the most recent observations)—may bias estimates. Notably, our 12-specialty framework does not capture career paths outside conventional specialty registration, such as aesthetic medicine</w:t>
+        <w:t>Several limitations warrant consideration. The ecological design precludes individual-level causal inference. Biennial physician data required interpolation, potentially smoothing abrupt transitions. The JMSR series spans only 11 years, limiting statistical power; when litigation data were restricted to the same 2015–2023 window, significant models fell from 18 to 4, confirming that the disparity between data sources is primarily a function of series length rather than an intrinsic difference between occurrence and litigation as predictors. Unmeasured confounders—demographic shifts, the 2004 postgraduate training reform, and the direct effects of work-style reform (temporally overlapping the most recent observations)—may bias estimates. Notably, our 12-specialty framework does not capture career paths outside conventional specialty registration, such as aesthetic medicine</w:t>
       </w:r>
       <w:r>
         <w:rPr>
@@ -9479,7 +9507,7 @@
           <w:i w:val="0"/>
           <w:sz w:val="24"/>
         </w:rPr>
-        <w:t>Safety incidents Granger-cause reductions in physician supply in 9 of 12 specialties, with effects persisting 3–5 years. Bidirectional causality in obstetrics, paediatrics, and general surgery points to a self-reinforcing shortage–incident cycle that, compounded by work-style reform and the emergence of career paths outside conventional specialty frameworks, poses a credible threat to essential medical services.</w:t>
+        <w:t>Safety incidents Granger-cause reductions in physician supply in 9 of 12 specialties, with effects persisting 3–5 years. Bidirectional causality in obstetrics, paediatrics, and general surgery points to a self-reinforcing shortage–incident cycle. Disrupting this cycle will require concurrent action on multiple fronts—economic incentives, non-punitive safety culture, minimum staffing safeguards, and effective work-style reform—within the 3–5 year policy window identified here.</w:t>
       </w:r>
     </w:p>
     <w:p>

</xml_diff>

<commit_message>
Discussion: occurrence-litigation independence supports dispute resolution as modifiable mediator
Co-Authored-By: Tatsuki Onishi <bougtoir@gmail.com>
</commit_message>
<xml_diff>
--- a/medical_accident_its_analysis/manuscript/jma_manuscript_en.docx
+++ b/medical_accident_its_analysis/manuscript/jma_manuscript_en.docx
@@ -9164,7 +9164,21 @@
           <w:i w:val="0"/>
           <w:sz w:val="24"/>
         </w:rPr>
-        <w:t>Using the full 20-year litigation series, forward Granger causality reached significance in 18 of 24 models (9 of 12 specialties for both physician and facility counts); obstetrics and gynaecology showed the strongest association (F = 46.66, P &lt; 0.001). The 11-year JMSR series yielded only 2 significant models (general surgery and psychiatry). A sensitivity analysis restricting litigation data to the overlapping 2015–2023 window (9 years) reduced significant models from 18 to 4, indicating that the apparent superiority of litigation-based results largely reflects greater statistical power afforded by the longer series rather than a qualitative difference between data sources.</w:t>
+        <w:t>Using the full 20-year litigation series, forward Granger causality reached significance in 18 of 24 models (9 of 12 specialties for both physician and facility counts); obstetrics and gynaecology showed the strongest association (F = 46.66, P &lt; 0.001). The 11-year JMSR series yielded only 2 significant models (general surgery and psychiatry). A sensitivity analysis restricting litigation data to the overlapping 2015–2023 window (9 years) reduced significant models from 18 to 4, indicating that the gap in significance counts largely reflects statistical power afforded by the longer series.</w:t>
+      </w:r>
+    </w:p>
+    <w:p>
+      <w:pPr>
+        <w:spacing w:after="120" w:line="480" w:lineRule="auto"/>
+      </w:pPr>
+      <w:r>
+        <w:rPr>
+          <w:rFonts w:ascii="Times New Roman" w:hAnsi="Times New Roman"/>
+          <w:b w:val="0"/>
+          <w:i w:val="0"/>
+          <w:sz w:val="24"/>
+        </w:rPr>
+        <w:t>Notably, JMSR incident counts and litigation counts were weakly correlated across the overlapping period (median |r| = 0.23; no specialty reached P &lt; 0.05). This independence implies that litigation captures a distinct dimension of professional risk—reputational exposure, financial liability, and prolonged procedural stress—that is not reducible to incident frequency. A trivariate VAR incorporating both sources simultaneously did not improve model fit over bivariate models (mean ΔAIC = +0.6), and an interaction term (occurrence × litigation) reached significance in only 1 of 22 models, consistent with additive rather than synergistic effects.</w:t>
       </w:r>
     </w:p>
     <w:p>
@@ -9318,7 +9332,17 @@
           <w:i w:val="0"/>
           <w:sz w:val="24"/>
         </w:rPr>
-        <w:t>Because both incident definitions—occurrence-based and litigation-based—predict workforce decline when series length is adequate, interventions should target the common upstream determinant: the safety event itself and its professional consequences. Several complementary levers emerge from our results.</w:t>
+        <w:t>The independence of occurrence and litigation counts has a direct policy corollary: because safety events occur with a certain irreducible probability, the litigation pathway constitutes a modifiable mediator. If malpractice disputes are resolved before reaching court—through early mediation, alternative dispute resolution, or no-fault compensation—the workforce signal associated with litigation may be attenuated without requiring a reduction in incident rates themselves.</w:t>
+      </w:r>
+      <w:r>
+        <w:rPr>
+          <w:rFonts w:ascii="Times New Roman" w:hAnsi="Times New Roman"/>
+          <w:b w:val="0"/>
+          <w:i w:val="0"/>
+          <w:sz w:val="20"/>
+          <w:vertAlign w:val="superscript"/>
+        </w:rPr>
+        <w:t>7,24</w:t>
       </w:r>
     </w:p>
     <w:p>
@@ -9332,7 +9356,7 @@
           <w:i w:val="0"/>
           <w:sz w:val="24"/>
         </w:rPr>
-        <w:t>First, economic incentives for high-risk specialties (enhanced remuneration, training stipends, rural service allowances) address the most proximate driver of specialty avoidance.</w:t>
+        <w:t>Beyond dispute resolution, several complementary levers emerge from our results. Economic incentives for high-risk specialties (enhanced remuneration, training stipends, rural service allowances) address the most proximate driver of specialty avoidance.</w:t>
       </w:r>
       <w:r>
         <w:rPr>
@@ -9351,7 +9375,7 @@
           <w:i w:val="0"/>
           <w:sz w:val="24"/>
         </w:rPr>
-        <w:t xml:space="preserve"> Second, fostering a non-punitive safety culture—structured post-incident psychological support, transparent root-cause analysis, and proportionate media reporting—may attenuate the deterrent signal of adverse events.</w:t>
+        <w:t xml:space="preserve"> Fostering a non-punitive safety culture—structured post-incident psychological support, transparent root-cause analysis, and proportionate media reporting—may attenuate the deterrent signal of adverse events.</w:t>
       </w:r>
       <w:r>
         <w:rPr>
@@ -9370,7 +9394,7 @@
           <w:i w:val="0"/>
           <w:sz w:val="24"/>
         </w:rPr>
-        <w:t xml:space="preserve"> Third, the reverse-causality pathway (fewer physicians → more incidents) implies that minimum staffing thresholds in specialties exhibiting bidirectional causality (obstetrics, paediatrics, general surgery) could interrupt the reinforcing cycle before it becomes self-sustaining. Fourth, effective implementation of work-style reform—including correction of deemed self-study practices and equitable redistribution of workload—is essential to prevent the reform itself from accelerating exit from demanding specialties.</w:t>
+        <w:t xml:space="preserve"> The reverse-causality pathway (fewer physicians → more incidents) implies that minimum staffing thresholds in specialties exhibiting bidirectional causality (obstetrics, paediatrics, general surgery) could interrupt the reinforcing cycle before it becomes self-sustaining. Effective implementation of work-style reform—including correction of deemed self-study practices and equitable redistribution of workload—is essential to prevent the reform itself from accelerating exit from demanding specialties.</w:t>
       </w:r>
     </w:p>
     <w:p>

</xml_diff>

<commit_message>
Restructure manuscript: fix Intro/Methods/Results/Discussion flow, renumber citations 1-28
- Abstract: add source-independence finding and dispute resolution conclusion
- Introduction: remove work-style reform paragraph, add aim to test source independence
- Methods: add sensitivity/correlation/trivariate analysis subsection
- Results: move sensitivity & source-independence findings from Discussion
- Discussion: open with three principal findings (not re-reporting results)
- Discussion: gaikin first explained in Work-style reform section
- Limitations: streamline (sensitivity result now in Results)
- Conclusions: highlight litigation as modifiable mediator
- Citations renumbered in Vancouver order (work-style refs 5,6 -> 22,23)

Co-Authored-By: Tatsuki Onishi <bougtoir@gmail.com>
</commit_message>
<xml_diff>
--- a/medical_accident_its_analysis/manuscript/jma_manuscript_en.docx
+++ b/medical_accident_its_analysis/manuscript/jma_manuscript_en.docx
@@ -33,7 +33,7 @@
           <w:i w:val="0"/>
           <w:sz w:val="24"/>
         </w:rPr>
-        <w:t>Medical safety incidents may deter physicians from high-risk specialties, yet the temporal dynamics remain poorly quantified. In Japan, workforce maldistribution has intensified amid the 2024 work-style reform, but no multi-specialty test of predictive causality between incidents and physician supply has been conducted.</w:t>
+        <w:t>Medical safety incidents may deter physicians from high-risk specialties, yet the temporal dynamics remain poorly quantified. Japan maintains two independent national incident series—occurrence-based mandatory reports and malpractice litigation statistics—but no multi-specialty test of predictive causality between these series and physician supply has been conducted.</w:t>
       </w:r>
     </w:p>
     <w:p>
@@ -55,7 +55,7 @@
           <w:i w:val="0"/>
           <w:sz w:val="24"/>
         </w:rPr>
-        <w:t>We constructed bivariate vector autoregression (VAR) models for 12 specialties using two national incident series—mandatory safety reports (2015–2025) and malpractice litigation statistics (2004–2023)—paired with physician and facility counts from national surveys. Granger causality F-tests, impulse response functions, and VAR-based forecasts were computed.</w:t>
+        <w:t>We constructed bivariate vector autoregression (VAR) models for 12 specialties using mandatory safety reports (2015–2025) and malpractice litigation statistics (2004–2023), paired with physician and facility counts from national surveys. Granger causality F-tests, impulse response functions, and VAR-based forecasts were computed. Sensitivity analyses assessed the independence and interaction of the two incident sources.</w:t>
       </w:r>
     </w:p>
     <w:p>
@@ -77,7 +77,7 @@
           <w:i w:val="0"/>
           <w:sz w:val="24"/>
         </w:rPr>
-        <w:t>Of 47 VAR models, 20 demonstrated significant forward Granger causality (incidents → workforce; P &lt; 0.05). The strongest association was in obstetrics and gynaecology (F = 46.66, P &lt; 0.001). Bidirectional causality emerged in 7 specialty–outcome pairs. Impulse response functions showed that a litigation shock depressed physician supply for 3–5 years. General surgery is projected to lose approximately 230 physicians per year through 2033.</w:t>
+        <w:t>Litigation-based models showed significant forward Granger causality in 18 of 24 tests; obstetrics and gynaecology had the strongest association (F = 46.66, P &lt; 0.001). Bidirectional causality emerged in 7 specialty–outcome pairs. A litigation shock depressed physician supply for 3–5 years. Occurrence and litigation counts were weakly correlated (median |r| = 0.23), and their interaction was non-significant, indicating additive, independent effects on workforce decline.</w:t>
       </w:r>
     </w:p>
     <w:p>
@@ -99,7 +99,7 @@
           <w:i w:val="0"/>
           <w:sz w:val="24"/>
         </w:rPr>
-        <w:t>Safety incidents Granger-cause specialty-specific workforce decline lasting 3–5 years. Coupled with work-style reform constraints, the resulting reinforcing cycle threatens essential medical services and demands integrated policy intervention.</w:t>
+        <w:t>Safety incidents Granger-cause specialty-specific workforce decline lasting 3–5 years through two independent pathways. Because litigation is largely independent of incident occurrence, early dispute resolution may attenuate workforce loss without requiring a reduction in incident rates.</w:t>
       </w:r>
     </w:p>
     <w:p>
@@ -113,7 +113,7 @@
           <w:i/>
           <w:sz w:val="24"/>
         </w:rPr>
-        <w:t>Key words: physician workforce, Granger causality, medical safety incidents, specialty maldistribution, work-style reform, Japan</w:t>
+        <w:t>Key words: physician workforce, Granger causality, medical safety incidents, specialty maldistribution, dispute resolution, Japan</w:t>
       </w:r>
     </w:p>
     <w:p>
@@ -187,7 +187,7 @@
           <w:i w:val="0"/>
           <w:sz w:val="24"/>
         </w:rPr>
-        <w:t>The April 2024 work-style reform, capping physician overtime at 960 hours annually, has curtailed "gaikin" (moonlighting opportunities) that long supplemented hospital incomes.</w:t>
+        <w:t>Safety incidents as a determinant of specialty choice gained prominence after the 2004 Fukushima obstetrics prosecution, in which an obstetrician was arrested following a maternal death during caesarean section.</w:t>
       </w:r>
       <w:r>
         <w:rPr>
@@ -206,39 +206,6 @@
           <w:i w:val="0"/>
           <w:sz w:val="24"/>
         </w:rPr>
-        <w:t xml:space="preserve"> How these regulatory constraints interact with incident-driven workforce dynamics remains untested beyond single-event case studies.</w:t>
-      </w:r>
-    </w:p>
-    <w:p>
-      <w:pPr>
-        <w:spacing w:after="120" w:line="480" w:lineRule="auto"/>
-      </w:pPr>
-      <w:r>
-        <w:rPr>
-          <w:rFonts w:ascii="Times New Roman" w:hAnsi="Times New Roman"/>
-          <w:b w:val="0"/>
-          <w:i w:val="0"/>
-          <w:sz w:val="24"/>
-        </w:rPr>
-        <w:t>Safety incidents as a determinant of specialty choice gained prominence after the 2004 Fukushima obstetrics prosecution, in which an obstetrician was arrested following a maternal death during caesarean section.</w:t>
-      </w:r>
-      <w:r>
-        <w:rPr>
-          <w:rFonts w:ascii="Times New Roman" w:hAnsi="Times New Roman"/>
-          <w:b w:val="0"/>
-          <w:i w:val="0"/>
-          <w:sz w:val="20"/>
-          <w:vertAlign w:val="superscript"/>
-        </w:rPr>
-        <w:t>7,8</w:t>
-      </w:r>
-      <w:r>
-        <w:rPr>
-          <w:rFonts w:ascii="Times New Roman" w:hAnsi="Times New Roman"/>
-          <w:b w:val="0"/>
-          <w:i w:val="0"/>
-          <w:sz w:val="24"/>
-        </w:rPr>
         <w:t xml:space="preserve"> Morita reported a 13% decline in obstetricians in the affected prefecture using difference-in-differences.</w:t>
       </w:r>
       <w:r>
@@ -249,7 +216,7 @@
           <w:sz w:val="20"/>
           <w:vertAlign w:val="superscript"/>
         </w:rPr>
-        <w:t>9</w:t>
+        <w:t>7</w:t>
       </w:r>
       <w:r>
         <w:rPr>
@@ -282,7 +249,7 @@
           <w:sz w:val="20"/>
           <w:vertAlign w:val="superscript"/>
         </w:rPr>
-        <w:t>10</w:t>
+        <w:t>8</w:t>
       </w:r>
       <w:r>
         <w:rPr>
@@ -301,7 +268,7 @@
           <w:sz w:val="20"/>
           <w:vertAlign w:val="superscript"/>
         </w:rPr>
-        <w:t>11,12</w:t>
+        <w:t>9,10</w:t>
       </w:r>
       <w:r>
         <w:rPr>
@@ -334,7 +301,7 @@
           <w:sz w:val="20"/>
           <w:vertAlign w:val="superscript"/>
         </w:rPr>
-        <w:t>13–15</w:t>
+        <w:t>11–13</w:t>
       </w:r>
       <w:r>
         <w:rPr>
@@ -343,7 +310,7 @@
           <w:i w:val="0"/>
           <w:sz w:val="24"/>
         </w:rPr>
-        <w:t>—established econometric tools for predictive-causality inference—to determine whether incident trends temporally precede changes in specialty-specific physician and facility counts across 12 specialties over up to 20 years.</w:t>
+        <w:t>—established econometric tools for predictive-causality inference—to determine whether incident trends temporally precede changes in specialty-specific physician and facility counts across 12 specialties over up to 20 years. Because the two incident series differ in construction (occurrence vs. adjudicated claims), we additionally examine whether they act as independent or interacting predictors of workforce change.</w:t>
       </w:r>
     </w:p>
     <w:p>
@@ -396,7 +363,7 @@
           <w:sz w:val="20"/>
           <w:vertAlign w:val="superscript"/>
         </w:rPr>
-        <w:t>16</w:t>
+        <w:t>14</w:t>
       </w:r>
     </w:p>
     <w:p>
@@ -432,7 +399,7 @@
           <w:sz w:val="20"/>
           <w:vertAlign w:val="superscript"/>
         </w:rPr>
-        <w:t>10</w:t>
+        <w:t>8</w:t>
       </w:r>
       <w:r>
         <w:rPr>
@@ -451,7 +418,7 @@
           <w:sz w:val="20"/>
           <w:vertAlign w:val="superscript"/>
         </w:rPr>
-        <w:t>11</w:t>
+        <w:t>9</w:t>
       </w:r>
     </w:p>
     <w:p>
@@ -475,7 +442,7 @@
           <w:sz w:val="20"/>
           <w:vertAlign w:val="superscript"/>
         </w:rPr>
-        <w:t>17</w:t>
+        <w:t>15</w:t>
       </w:r>
       <w:r>
         <w:rPr>
@@ -494,7 +461,7 @@
           <w:sz w:val="20"/>
           <w:vertAlign w:val="superscript"/>
         </w:rPr>
-        <w:t>18</w:t>
+        <w:t>16</w:t>
       </w:r>
       <w:r>
         <w:rPr>
@@ -513,7 +480,7 @@
           <w:sz w:val="20"/>
           <w:vertAlign w:val="superscript"/>
         </w:rPr>
-        <w:t>19</w:t>
+        <w:t>17</w:t>
       </w:r>
     </w:p>
     <w:p>
@@ -589,7 +556,7 @@
           <w:sz w:val="20"/>
           <w:vertAlign w:val="superscript"/>
         </w:rPr>
-        <w:t>20</w:t>
+        <w:t>18</w:t>
       </w:r>
       <w:r>
         <w:rPr>
@@ -622,7 +589,7 @@
           <w:sz w:val="20"/>
           <w:vertAlign w:val="superscript"/>
         </w:rPr>
-        <w:t>21</w:t>
+        <w:t>19</w:t>
       </w:r>
       <w:r>
         <w:rPr>
@@ -655,7 +622,7 @@
           <w:sz w:val="20"/>
           <w:vertAlign w:val="superscript"/>
         </w:rPr>
-        <w:t>22</w:t>
+        <w:t>20</w:t>
       </w:r>
       <w:r>
         <w:rPr>
@@ -665,6 +632,46 @@
           <w:sz w:val="24"/>
         </w:rPr>
         <w:t xml:space="preserve"> Code and data are deposited at https://github.com/bougtoir/medical-accident-its-analysis.</w:t>
+      </w:r>
+    </w:p>
+    <w:p>
+      <w:pPr>
+        <w:pStyle w:val="Heading2"/>
+      </w:pPr>
+      <w:r>
+        <w:rPr>
+          <w:rFonts w:ascii="Times New Roman" w:hAnsi="Times New Roman"/>
+          <w:color w:val="000000"/>
+        </w:rPr>
+        <w:t>Sensitivity and source-independence analyses</w:t>
+      </w:r>
+    </w:p>
+    <w:p>
+      <w:pPr>
+        <w:spacing w:after="120" w:line="480" w:lineRule="auto"/>
+      </w:pPr>
+      <w:r>
+        <w:rPr>
+          <w:rFonts w:ascii="Times New Roman" w:hAnsi="Times New Roman"/>
+          <w:b w:val="0"/>
+          <w:i w:val="0"/>
+          <w:sz w:val="24"/>
+        </w:rPr>
+        <w:t>To assess whether the disparity in significant models between litigation and JMSR reflected series length rather than intrinsic differences, litigation data were restricted to the 2015–2023 window (9 years) overlapping with the JMSR period and the Granger tests were repeated.</w:t>
+      </w:r>
+    </w:p>
+    <w:p>
+      <w:pPr>
+        <w:spacing w:after="120" w:line="480" w:lineRule="auto"/>
+      </w:pPr>
+      <w:r>
+        <w:rPr>
+          <w:rFonts w:ascii="Times New Roman" w:hAnsi="Times New Roman"/>
+          <w:b w:val="0"/>
+          <w:i w:val="0"/>
+          <w:sz w:val="24"/>
+        </w:rPr>
+        <w:t>To evaluate source independence, Pearson correlations between JMSR and litigation counts were computed for each specialty over the overlapping period. To test whether occurrence and litigation act additively or synergistically, trivariate VAR models (JMSR + litigation + outcome) were fitted and compared with bivariate models by AIC. An interaction term (JMSR × litigation) was tested for additional predictive power via Granger F-tests.</w:t>
       </w:r>
     </w:p>
     <w:p>
@@ -9137,6 +9144,46 @@
       </w:r>
     </w:p>
     <w:p>
+      <w:pPr>
+        <w:pStyle w:val="Heading2"/>
+      </w:pPr>
+      <w:r>
+        <w:rPr>
+          <w:rFonts w:ascii="Times New Roman" w:hAnsi="Times New Roman"/>
+          <w:color w:val="000000"/>
+        </w:rPr>
+        <w:t>Sensitivity and source-independence analyses</w:t>
+      </w:r>
+    </w:p>
+    <w:p>
+      <w:pPr>
+        <w:spacing w:after="120" w:line="480" w:lineRule="auto"/>
+      </w:pPr>
+      <w:r>
+        <w:rPr>
+          <w:rFonts w:ascii="Times New Roman" w:hAnsi="Times New Roman"/>
+          <w:b w:val="0"/>
+          <w:i w:val="0"/>
+          <w:sz w:val="24"/>
+        </w:rPr>
+        <w:t>When litigation data were restricted to the 2015–2023 window (9 years, matching the JMSR period), significant forward Granger models fell from 18 to 4, indicating that the disparity in significance counts between data sources largely reflects statistical power afforded by the longer series rather than an intrinsic difference between occurrence and litigation as predictors.</w:t>
+      </w:r>
+    </w:p>
+    <w:p>
+      <w:pPr>
+        <w:spacing w:after="120" w:line="480" w:lineRule="auto"/>
+      </w:pPr>
+      <w:r>
+        <w:rPr>
+          <w:rFonts w:ascii="Times New Roman" w:hAnsi="Times New Roman"/>
+          <w:b w:val="0"/>
+          <w:i w:val="0"/>
+          <w:sz w:val="24"/>
+        </w:rPr>
+        <w:t>JMSR incident counts and litigation counts were weakly correlated across the overlapping period (median |r| = 0.23; no specialty reached P &lt; 0.05). Trivariate VAR models incorporating both sources simultaneously did not improve fit over bivariate models (mean ΔAIC = +0.6), and an interaction term (occurrence × litigation) reached significance in only 1 of 22 models, consistent with additive rather than synergistic effects.</w:t>
+      </w:r>
+    </w:p>
+    <w:p>
       <w:r>
         <w:br w:type="page"/>
       </w:r>
@@ -9164,21 +9211,7 @@
           <w:i w:val="0"/>
           <w:sz w:val="24"/>
         </w:rPr>
-        <w:t>Using the full 20-year litigation series, forward Granger causality reached significance in 18 of 24 models (9 of 12 specialties for both physician and facility counts); obstetrics and gynaecology showed the strongest association (F = 46.66, P &lt; 0.001). The 11-year JMSR series yielded only 2 significant models (general surgery and psychiatry). A sensitivity analysis restricting litigation data to the overlapping 2015–2023 window (9 years) reduced significant models from 18 to 4, indicating that the gap in significance counts largely reflects statistical power afforded by the longer series.</w:t>
-      </w:r>
-    </w:p>
-    <w:p>
-      <w:pPr>
-        <w:spacing w:after="120" w:line="480" w:lineRule="auto"/>
-      </w:pPr>
-      <w:r>
-        <w:rPr>
-          <w:rFonts w:ascii="Times New Roman" w:hAnsi="Times New Roman"/>
-          <w:b w:val="0"/>
-          <w:i w:val="0"/>
-          <w:sz w:val="24"/>
-        </w:rPr>
-        <w:t>Notably, JMSR incident counts and litigation counts were weakly correlated across the overlapping period (median |r| = 0.23; no specialty reached P &lt; 0.05). This independence implies that litigation captures a distinct dimension of professional risk—reputational exposure, financial liability, and prolonged procedural stress—that is not reducible to incident frequency. A trivariate VAR incorporating both sources simultaneously did not improve model fit over bivariate models (mean ΔAIC = +0.6), and an interaction term (occurrence × litigation) reached significance in only 1 of 22 models, consistent with additive rather than synergistic effects.</w:t>
+        <w:t>This multi-specialty Granger causality analysis yields three principal findings. First, safety incidents—whether measured by occurrence reports or litigation—temporally precede workforce decline in the majority of specialties when series length affords adequate statistical power. Second, the two incident sources are largely independent (median |r| = 0.23), implying that litigation captures a distinct dimension of professional risk—reputational exposure, financial liability, and prolonged procedural stress—not reducible to incident frequency. Third, these sources act additively rather than synergistically, suggesting that interventions targeting either pathway may yield independent workforce benefits.</w:t>
       </w:r>
     </w:p>
     <w:p>
@@ -9214,7 +9247,7 @@
           <w:sz w:val="20"/>
           <w:vertAlign w:val="superscript"/>
         </w:rPr>
-        <w:t>1,9</w:t>
+        <w:t>1,7</w:t>
       </w:r>
       <w:r>
         <w:rPr>
@@ -9233,7 +9266,7 @@
           <w:sz w:val="20"/>
           <w:vertAlign w:val="superscript"/>
         </w:rPr>
-        <w:t>23</w:t>
+        <w:t>21</w:t>
       </w:r>
       <w:r>
         <w:rPr>
@@ -9278,7 +9311,7 @@
           <w:sz w:val="20"/>
           <w:vertAlign w:val="superscript"/>
         </w:rPr>
-        <w:t>5</w:t>
+        <w:t>22</w:t>
       </w:r>
       <w:r>
         <w:rPr>
@@ -9287,7 +9320,7 @@
           <w:i w:val="0"/>
           <w:sz w:val="24"/>
         </w:rPr>
-        <w:t xml:space="preserve"> Restrictions on "gaikin" have eroded the income supplement that historically offset demanding hospital posts, while deemed self-study—hours reclassified as voluntary training rather than compensable labour—has shifted workload onto mid-career physicians without relieving trainee burden.</w:t>
+        <w:t xml:space="preserve"> Restrictions on "gaikin" (moonlighting opportunities) have eroded the income supplement that historically offset demanding hospital posts, while deemed self-study—hours reclassified as voluntary training rather than compensable labour—has shifted workload onto mid-career physicians without relieving trainee burden.</w:t>
       </w:r>
       <w:r>
         <w:rPr>
@@ -9297,7 +9330,7 @@
           <w:sz w:val="20"/>
           <w:vertAlign w:val="superscript"/>
         </w:rPr>
-        <w:t>6</w:t>
+        <w:t>23</w:t>
       </w:r>
       <w:r>
         <w:rPr>
@@ -9342,7 +9375,7 @@
           <w:sz w:val="20"/>
           <w:vertAlign w:val="superscript"/>
         </w:rPr>
-        <w:t>7,24</w:t>
+        <w:t>5,24</w:t>
       </w:r>
     </w:p>
     <w:p>
@@ -9385,7 +9418,7 @@
           <w:sz w:val="20"/>
           <w:vertAlign w:val="superscript"/>
         </w:rPr>
-        <w:t>7</w:t>
+        <w:t>5</w:t>
       </w:r>
       <w:r>
         <w:rPr>
@@ -9448,7 +9481,7 @@
           <w:i w:val="0"/>
           <w:sz w:val="24"/>
         </w:rPr>
-        <w:t>Several limitations warrant consideration. The ecological design precludes individual-level causal inference. Biennial physician data required interpolation, potentially smoothing abrupt transitions. The JMSR series spans only 11 years, limiting statistical power; when litigation data were restricted to the same 2015–2023 window, significant models fell from 18 to 4, confirming that the disparity between data sources is primarily a function of series length rather than an intrinsic difference between occurrence and litigation as predictors. Unmeasured confounders—demographic shifts, the 2004 postgraduate training reform, and the direct effects of work-style reform (temporally overlapping the most recent observations)—may bias estimates. Notably, our 12-specialty framework does not capture career paths outside conventional specialty registration, such as aesthetic medicine</w:t>
+        <w:t>Several limitations warrant consideration. The ecological design precludes individual-level causal inference. Biennial physician data required interpolation, potentially smoothing abrupt transitions. The JMSR series spans only 11 years, limiting statistical power for that data source. Unmeasured confounders—demographic shifts, the 2004 postgraduate training reform, and the direct effects of work-style reform (temporally overlapping the most recent observations)—may bias estimates. Notably, our 12-specialty framework does not capture career paths outside conventional specialty registration, such as aesthetic medicine</w:t>
       </w:r>
       <w:r>
         <w:rPr>
@@ -9531,7 +9564,7 @@
           <w:i w:val="0"/>
           <w:sz w:val="24"/>
         </w:rPr>
-        <w:t>Safety incidents Granger-cause reductions in physician supply in 9 of 12 specialties, with effects persisting 3–5 years. Bidirectional causality in obstetrics, paediatrics, and general surgery points to a self-reinforcing shortage–incident cycle. Disrupting this cycle will require concurrent action on multiple fronts—economic incentives, non-punitive safety culture, minimum staffing safeguards, and effective work-style reform—within the 3–5 year policy window identified here.</w:t>
+        <w:t>Safety incidents Granger-cause reductions in physician supply in 9 of 12 specialties, with effects persisting 3–5 years. Occurrence-based and litigation-based incident counts are largely independent yet both predict workforce decline, identifying litigation as a modifiable mediator. Early dispute resolution, combined with economic incentives, non-punitive safety culture, and minimum staffing safeguards, may interrupt the reinforcing shortage–incident cycle within the 3–5 year policy window identified here.</w:t>
       </w:r>
     </w:p>
     <w:p>
@@ -9743,7 +9776,7 @@
           <w:rFonts w:ascii="Times New Roman" w:hAnsi="Times New Roman"/>
           <w:sz w:val="20"/>
         </w:rPr>
-        <w:t>5. Ishikawa T, Ohba H, Yokooka Y, et al. Labor shortage of physicians in rural areas and surgical specialties caused by Work Style Reform Policies of the Japanese government: a quantitative simulation analysis. J Rural Med. 2024;19(3):198-207.</w:t>
+        <w:t>5. Nagamatsu S, Kami M, Nakata Y. Healthcare safety committee in Japan: mandatory accountability reporting system and punishment. Curr Opin Anaesthesiol. 2009;22(2):199-206.</w:t>
       </w:r>
     </w:p>
     <w:p>
@@ -9755,7 +9788,7 @@
           <w:rFonts w:ascii="Times New Roman" w:hAnsi="Times New Roman"/>
           <w:sz w:val="20"/>
         </w:rPr>
-        <w:t>6. Japan Medical Association. Survey on physician work-style reform implementation status. Tokyo: JMA; 2024. Japanese.</w:t>
+        <w:t>6. Hiyama T, Yoshihara M, Tanaka S, et al. Defensive medicine practices among gastroenterologists in Japan. World J Gastroenterol. 2006;12(47):7671-5.</w:t>
       </w:r>
     </w:p>
     <w:p>
@@ -9767,7 +9800,7 @@
           <w:rFonts w:ascii="Times New Roman" w:hAnsi="Times New Roman"/>
           <w:sz w:val="20"/>
         </w:rPr>
-        <w:t>7. Nagamatsu S, Kami M, Nakata Y. Healthcare safety committee in Japan: mandatory accountability reporting system and punishment. Curr Opin Anaesthesiol. 2009;22(2):199-206.</w:t>
+        <w:t>7. Morita H. Criminal prosecution and physician supply. Int Rev Law Econ. 2018;55:1-11.</w:t>
       </w:r>
     </w:p>
     <w:p>
@@ -9779,7 +9812,7 @@
           <w:rFonts w:ascii="Times New Roman" w:hAnsi="Times New Roman"/>
           <w:sz w:val="20"/>
         </w:rPr>
-        <w:t>8. Hiyama T, Yoshihara M, Tanaka S, et al. Defensive medicine practices among gastroenterologists in Japan. World J Gastroenterol. 2006;12(47):7671-5.</w:t>
+        <w:t>8. Japan Medical Safety Research Organisation. Annual report on medical accident investigation. Tokyo: JMSR; 2025. Available from: https://www.medsafe.or.jp/</w:t>
       </w:r>
     </w:p>
     <w:p>
@@ -9791,7 +9824,7 @@
           <w:rFonts w:ascii="Times New Roman" w:hAnsi="Times New Roman"/>
           <w:sz w:val="20"/>
         </w:rPr>
-        <w:t>9. Morita H. Criminal prosecution and physician supply. Int Rev Law Econ. 2018;55:1-11.</w:t>
+        <w:t>9. Supreme Court of Japan. Annual report of judicial statistics: medical malpractice litigation. Tokyo: Supreme Court; 2024. Japanese.</w:t>
       </w:r>
     </w:p>
     <w:p>
@@ -9803,7 +9836,7 @@
           <w:rFonts w:ascii="Times New Roman" w:hAnsi="Times New Roman"/>
           <w:sz w:val="20"/>
         </w:rPr>
-        <w:t>10. Japan Medical Safety Research Organisation. Annual report on medical accident investigation. Tokyo: JMSR; 2025. Available from: https://www.medsafe.or.jp/</w:t>
+        <w:t>10. Taniguchi K, Watari T, Nagoshi K. Characteristics and trends of medical malpractice claims in Japan between 2006 and 2021. PLoS One. 2024;19(1):e0296155.</w:t>
       </w:r>
     </w:p>
     <w:p>
@@ -9815,7 +9848,7 @@
           <w:rFonts w:ascii="Times New Roman" w:hAnsi="Times New Roman"/>
           <w:sz w:val="20"/>
         </w:rPr>
-        <w:t>11. Supreme Court of Japan. Annual report of judicial statistics: medical malpractice litigation. Tokyo: Supreme Court; 2024. Japanese.</w:t>
+        <w:t>11. Granger CWJ. Investigating causal relations by econometric models and cross-spectral methods. Econometrica. 1969;37(3):424-38.</w:t>
       </w:r>
     </w:p>
     <w:p>
@@ -9827,7 +9860,7 @@
           <w:rFonts w:ascii="Times New Roman" w:hAnsi="Times New Roman"/>
           <w:sz w:val="20"/>
         </w:rPr>
-        <w:t>12. Taniguchi K, Watari T, Nagoshi K. Characteristics and trends of medical malpractice claims in Japan between 2006 and 2021. PLoS One. 2024;19(1):e0296155.</w:t>
+        <w:t>12. Lütkepohl H. New Introduction to Multiple Time Series Analysis. Berlin: Springer; 2005.</w:t>
       </w:r>
     </w:p>
     <w:p>
@@ -9839,7 +9872,7 @@
           <w:rFonts w:ascii="Times New Roman" w:hAnsi="Times New Roman"/>
           <w:sz w:val="20"/>
         </w:rPr>
-        <w:t>13. Granger CWJ. Investigating causal relations by econometric models and cross-spectral methods. Econometrica. 1969;37(3):424-38.</w:t>
+        <w:t>13. Toda HY, Yamamoto T. Statistical inference in vector autoregressions with possibly integrated processes. J Econom. 1995;66(1-2):225-50.</w:t>
       </w:r>
     </w:p>
     <w:p>
@@ -9851,7 +9884,7 @@
           <w:rFonts w:ascii="Times New Roman" w:hAnsi="Times New Roman"/>
           <w:sz w:val="20"/>
         </w:rPr>
-        <w:t>14. Lütkepohl H. New Introduction to Multiple Time Series Analysis. Berlin: Springer; 2005.</w:t>
+        <w:t>14. von Elm E, Altman DG, Egger M, et al. The Strengthening the Reporting of Observational Studies in Epidemiology (STROBE) statement: guidelines for reporting observational studies. Lancet. 2007;370(9596):1453-7.</w:t>
       </w:r>
     </w:p>
     <w:p>
@@ -9863,7 +9896,7 @@
           <w:rFonts w:ascii="Times New Roman" w:hAnsi="Times New Roman"/>
           <w:sz w:val="20"/>
         </w:rPr>
-        <w:t>15. Toda HY, Yamamoto T. Statistical inference in vector autoregressions with possibly integrated processes. J Econom. 1995;66(1-2):225-50.</w:t>
+        <w:t>15. Ministry of Health, Labour and Welfare. Survey of physicians, dentists, and pharmacists. Tokyo: MHLW; 2024. Japanese.</w:t>
       </w:r>
     </w:p>
     <w:p>
@@ -9875,7 +9908,7 @@
           <w:rFonts w:ascii="Times New Roman" w:hAnsi="Times New Roman"/>
           <w:sz w:val="20"/>
         </w:rPr>
-        <w:t>16. von Elm E, Altman DG, Egger M, et al. The Strengthening the Reporting of Observational Studies in Epidemiology (STROBE) statement: guidelines for reporting observational studies. Lancet. 2007;370(9596):1453-7.</w:t>
+        <w:t>16. Ministry of Health, Labour and Welfare. Survey of medical institutions (dynamic survey). Tokyo: MHLW; 2024. Japanese.</w:t>
       </w:r>
     </w:p>
     <w:p>
@@ -9887,7 +9920,7 @@
           <w:rFonts w:ascii="Times New Roman" w:hAnsi="Times New Roman"/>
           <w:sz w:val="20"/>
         </w:rPr>
-        <w:t>17. Ministry of Health, Labour and Welfare. Survey of physicians, dentists, and pharmacists. Tokyo: MHLW; 2024. Japanese.</w:t>
+        <w:t>17. Japan Board of Medical Specialties. Specialist trainee registration statistics. Tokyo: JBMS; 2025. Japanese.</w:t>
       </w:r>
     </w:p>
     <w:p>
@@ -9899,7 +9932,7 @@
           <w:rFonts w:ascii="Times New Roman" w:hAnsi="Times New Roman"/>
           <w:sz w:val="20"/>
         </w:rPr>
-        <w:t>18. Ministry of Health, Labour and Welfare. Survey of medical institutions (dynamic survey). Tokyo: MHLW; 2024. Japanese.</w:t>
+        <w:t>18. Hamilton JD. Time Series Analysis. Princeton: Princeton University Press; 1994.</w:t>
       </w:r>
     </w:p>
     <w:p>
@@ -9911,7 +9944,7 @@
           <w:rFonts w:ascii="Times New Roman" w:hAnsi="Times New Roman"/>
           <w:sz w:val="20"/>
         </w:rPr>
-        <w:t>19. Japan Board of Medical Specialties. Specialist trainee registration statistics. Tokyo: JBMS; 2025. Japanese.</w:t>
+        <w:t>19. Sims CA. Macroeconomics and reality. Econometrica. 1980;48(1):1-48.</w:t>
       </w:r>
     </w:p>
     <w:p>
@@ -9923,7 +9956,7 @@
           <w:rFonts w:ascii="Times New Roman" w:hAnsi="Times New Roman"/>
           <w:sz w:val="20"/>
         </w:rPr>
-        <w:t>20. Hamilton JD. Time Series Analysis. Princeton: Princeton University Press; 1994.</w:t>
+        <w:t>20. Seabold S, Perktold J. Statsmodels: econometric and statistical modeling with Python. Proc 9th Python Sci Conf. 2010:92-6.</w:t>
       </w:r>
     </w:p>
     <w:p>
@@ -9935,7 +9968,7 @@
           <w:rFonts w:ascii="Times New Roman" w:hAnsi="Times New Roman"/>
           <w:sz w:val="20"/>
         </w:rPr>
-        <w:t>21. Sims CA. Macroeconomics and reality. Econometrica. 1980;48(1):1-48.</w:t>
+        <w:t>21. Studdert DM, Mello MM, Sage WM, et al. Defensive medicine among high-risk specialist physicians in a volatile malpractice environment. JAMA. 2005;293(21):2609-17.</w:t>
       </w:r>
     </w:p>
     <w:p>
@@ -9947,7 +9980,7 @@
           <w:rFonts w:ascii="Times New Roman" w:hAnsi="Times New Roman"/>
           <w:sz w:val="20"/>
         </w:rPr>
-        <w:t>22. Seabold S, Perktold J. Statsmodels: econometric and statistical modeling with Python. Proc 9th Python Sci Conf. 2010:92-6.</w:t>
+        <w:t>22. Ishikawa T, Ohba H, Yokooka Y, et al. Labor shortage of physicians in rural areas and surgical specialties caused by Work Style Reform Policies of the Japanese government: a quantitative simulation analysis. J Rural Med. 2024;19(3):198-207.</w:t>
       </w:r>
     </w:p>
     <w:p>
@@ -9959,7 +9992,7 @@
           <w:rFonts w:ascii="Times New Roman" w:hAnsi="Times New Roman"/>
           <w:sz w:val="20"/>
         </w:rPr>
-        <w:t>23. Studdert DM, Mello MM, Sage WM, et al. Defensive medicine among high-risk specialist physicians in a volatile malpractice environment. JAMA. 2005;293(21):2609-17.</w:t>
+        <w:t>23. Japan Medical Association. Survey on physician work-style reform implementation status. Tokyo: JMA; 2024. Japanese.</w:t>
       </w:r>
     </w:p>
     <w:p>

</xml_diff>